<commit_message>
Chapitre 5 : ordre des figures et tableaux corrige (Word reconstruit)
Co-Authored-By: Claude Opus 5.5 <noreply@anthropic.com>
Claude-Session: https://claude.ai/code/session_01MvWM2RsXLqs8AZ6tPg6HLB
</commit_message>
<xml_diff>
--- a/REDACTION/chapitre5/Chapitre5_Simulation_et_analyse_des_performances.docx
+++ b/REDACTION/chapitre5/Chapitre5_Simulation_et_analyse_des_performances.docx
@@ -1338,11 +1338,11 @@
         <w:tblLayout w:type="fixed"/>
       </w:tblPr>
       <w:tblGrid>
-        <w:gridCol w:w="478"/>
-        <w:gridCol w:w="3479"/>
-        <w:gridCol w:w="1455"/>
-        <w:gridCol w:w="1245"/>
-        <w:gridCol w:w="2130"/>
+        <w:gridCol w:w="620"/>
+        <w:gridCol w:w="3372"/>
+        <w:gridCol w:w="1443"/>
+        <w:gridCol w:w="1250"/>
+        <w:gridCol w:w="2102"/>
       </w:tblGrid>
       <w:tr>
         <w:trPr>
@@ -1351,7 +1351,7 @@
         </w:trPr>
         <w:tc>
           <w:tcPr>
-            <w:tcW w:type="dxa" w:w="478"/>
+            <w:tcW w:type="dxa" w:w="620"/>
             <w:tcMar>
               <w:top w:type="dxa" w:w="40"/>
               <w:left w:type="dxa" w:w="80"/>
@@ -1376,7 +1376,7 @@
         </w:tc>
         <w:tc>
           <w:tcPr>
-            <w:tcW w:type="dxa" w:w="3479"/>
+            <w:tcW w:type="dxa" w:w="3372"/>
             <w:tcMar>
               <w:top w:type="dxa" w:w="40"/>
               <w:left w:type="dxa" w:w="80"/>
@@ -1401,7 +1401,7 @@
         </w:tc>
         <w:tc>
           <w:tcPr>
-            <w:tcW w:type="dxa" w:w="1455"/>
+            <w:tcW w:type="dxa" w:w="1443"/>
             <w:tcMar>
               <w:top w:type="dxa" w:w="40"/>
               <w:left w:type="dxa" w:w="80"/>
@@ -1426,7 +1426,7 @@
         </w:tc>
         <w:tc>
           <w:tcPr>
-            <w:tcW w:type="dxa" w:w="1245"/>
+            <w:tcW w:type="dxa" w:w="1250"/>
             <w:tcMar>
               <w:top w:type="dxa" w:w="40"/>
               <w:left w:type="dxa" w:w="80"/>
@@ -1451,7 +1451,7 @@
         </w:tc>
         <w:tc>
           <w:tcPr>
-            <w:tcW w:type="dxa" w:w="2130"/>
+            <w:tcW w:type="dxa" w:w="2102"/>
             <w:tcMar>
               <w:top w:type="dxa" w:w="40"/>
               <w:left w:type="dxa" w:w="80"/>
@@ -1482,7 +1482,7 @@
         </w:trPr>
         <w:tc>
           <w:tcPr>
-            <w:tcW w:type="dxa" w:w="478"/>
+            <w:tcW w:type="dxa" w:w="620"/>
             <w:tcMar>
               <w:top w:type="dxa" w:w="40"/>
               <w:left w:type="dxa" w:w="80"/>
@@ -1503,7 +1503,7 @@
         </w:tc>
         <w:tc>
           <w:tcPr>
-            <w:tcW w:type="dxa" w:w="3479"/>
+            <w:tcW w:type="dxa" w:w="3372"/>
             <w:tcMar>
               <w:top w:type="dxa" w:w="40"/>
               <w:left w:type="dxa" w:w="80"/>
@@ -1544,7 +1544,7 @@
         </w:tc>
         <w:tc>
           <w:tcPr>
-            <w:tcW w:type="dxa" w:w="1455"/>
+            <w:tcW w:type="dxa" w:w="1443"/>
             <w:tcMar>
               <w:top w:type="dxa" w:w="40"/>
               <w:left w:type="dxa" w:w="80"/>
@@ -1565,7 +1565,7 @@
         </w:tc>
         <w:tc>
           <w:tcPr>
-            <w:tcW w:type="dxa" w:w="1245"/>
+            <w:tcW w:type="dxa" w:w="1250"/>
             <w:tcMar>
               <w:top w:type="dxa" w:w="40"/>
               <w:left w:type="dxa" w:w="80"/>
@@ -1586,7 +1586,7 @@
         </w:tc>
         <w:tc>
           <w:tcPr>
-            <w:tcW w:type="dxa" w:w="2130"/>
+            <w:tcW w:type="dxa" w:w="2102"/>
             <w:tcMar>
               <w:top w:type="dxa" w:w="40"/>
               <w:left w:type="dxa" w:w="80"/>
@@ -1613,7 +1613,7 @@
         </w:trPr>
         <w:tc>
           <w:tcPr>
-            <w:tcW w:type="dxa" w:w="478"/>
+            <w:tcW w:type="dxa" w:w="620"/>
             <w:tcMar>
               <w:top w:type="dxa" w:w="40"/>
               <w:left w:type="dxa" w:w="80"/>
@@ -1634,7 +1634,7 @@
         </w:tc>
         <w:tc>
           <w:tcPr>
-            <w:tcW w:type="dxa" w:w="3479"/>
+            <w:tcW w:type="dxa" w:w="3372"/>
             <w:tcMar>
               <w:top w:type="dxa" w:w="40"/>
               <w:left w:type="dxa" w:w="80"/>
@@ -1665,7 +1665,7 @@
         </w:tc>
         <w:tc>
           <w:tcPr>
-            <w:tcW w:type="dxa" w:w="1455"/>
+            <w:tcW w:type="dxa" w:w="1443"/>
             <w:tcMar>
               <w:top w:type="dxa" w:w="40"/>
               <w:left w:type="dxa" w:w="80"/>
@@ -1686,7 +1686,7 @@
         </w:tc>
         <w:tc>
           <w:tcPr>
-            <w:tcW w:type="dxa" w:w="1245"/>
+            <w:tcW w:type="dxa" w:w="1250"/>
             <w:tcMar>
               <w:top w:type="dxa" w:w="40"/>
               <w:left w:type="dxa" w:w="80"/>
@@ -1707,7 +1707,7 @@
         </w:tc>
         <w:tc>
           <w:tcPr>
-            <w:tcW w:type="dxa" w:w="2130"/>
+            <w:tcW w:type="dxa" w:w="2102"/>
             <w:tcMar>
               <w:top w:type="dxa" w:w="40"/>
               <w:left w:type="dxa" w:w="80"/>
@@ -1734,7 +1734,7 @@
         </w:trPr>
         <w:tc>
           <w:tcPr>
-            <w:tcW w:type="dxa" w:w="478"/>
+            <w:tcW w:type="dxa" w:w="620"/>
             <w:tcMar>
               <w:top w:type="dxa" w:w="40"/>
               <w:left w:type="dxa" w:w="80"/>
@@ -1755,7 +1755,7 @@
         </w:tc>
         <w:tc>
           <w:tcPr>
-            <w:tcW w:type="dxa" w:w="3479"/>
+            <w:tcW w:type="dxa" w:w="3372"/>
             <w:tcMar>
               <w:top w:type="dxa" w:w="40"/>
               <w:left w:type="dxa" w:w="80"/>
@@ -1776,7 +1776,7 @@
         </w:tc>
         <w:tc>
           <w:tcPr>
-            <w:tcW w:type="dxa" w:w="1455"/>
+            <w:tcW w:type="dxa" w:w="1443"/>
             <w:tcMar>
               <w:top w:type="dxa" w:w="40"/>
               <w:left w:type="dxa" w:w="80"/>
@@ -1797,7 +1797,7 @@
         </w:tc>
         <w:tc>
           <w:tcPr>
-            <w:tcW w:type="dxa" w:w="1245"/>
+            <w:tcW w:type="dxa" w:w="1250"/>
             <w:tcMar>
               <w:top w:type="dxa" w:w="40"/>
               <w:left w:type="dxa" w:w="80"/>
@@ -1818,7 +1818,7 @@
         </w:tc>
         <w:tc>
           <w:tcPr>
-            <w:tcW w:type="dxa" w:w="2130"/>
+            <w:tcW w:type="dxa" w:w="2102"/>
             <w:tcMar>
               <w:top w:type="dxa" w:w="40"/>
               <w:left w:type="dxa" w:w="80"/>
@@ -1845,7 +1845,7 @@
         </w:trPr>
         <w:tc>
           <w:tcPr>
-            <w:tcW w:type="dxa" w:w="478"/>
+            <w:tcW w:type="dxa" w:w="620"/>
             <w:tcMar>
               <w:top w:type="dxa" w:w="40"/>
               <w:left w:type="dxa" w:w="80"/>
@@ -1866,7 +1866,7 @@
         </w:tc>
         <w:tc>
           <w:tcPr>
-            <w:tcW w:type="dxa" w:w="3479"/>
+            <w:tcW w:type="dxa" w:w="3372"/>
             <w:tcMar>
               <w:top w:type="dxa" w:w="40"/>
               <w:left w:type="dxa" w:w="80"/>
@@ -1897,7 +1897,7 @@
         </w:tc>
         <w:tc>
           <w:tcPr>
-            <w:tcW w:type="dxa" w:w="1455"/>
+            <w:tcW w:type="dxa" w:w="1443"/>
             <w:tcMar>
               <w:top w:type="dxa" w:w="40"/>
               <w:left w:type="dxa" w:w="80"/>
@@ -1918,7 +1918,7 @@
         </w:tc>
         <w:tc>
           <w:tcPr>
-            <w:tcW w:type="dxa" w:w="1245"/>
+            <w:tcW w:type="dxa" w:w="1250"/>
             <w:tcMar>
               <w:top w:type="dxa" w:w="40"/>
               <w:left w:type="dxa" w:w="80"/>
@@ -1939,7 +1939,7 @@
         </w:tc>
         <w:tc>
           <w:tcPr>
-            <w:tcW w:type="dxa" w:w="2130"/>
+            <w:tcW w:type="dxa" w:w="2102"/>
             <w:tcMar>
               <w:top w:type="dxa" w:w="40"/>
               <w:left w:type="dxa" w:w="80"/>
@@ -1966,7 +1966,7 @@
         </w:trPr>
         <w:tc>
           <w:tcPr>
-            <w:tcW w:type="dxa" w:w="478"/>
+            <w:tcW w:type="dxa" w:w="620"/>
             <w:tcMar>
               <w:top w:type="dxa" w:w="40"/>
               <w:left w:type="dxa" w:w="80"/>
@@ -1987,7 +1987,7 @@
         </w:tc>
         <w:tc>
           <w:tcPr>
-            <w:tcW w:type="dxa" w:w="3479"/>
+            <w:tcW w:type="dxa" w:w="3372"/>
             <w:tcMar>
               <w:top w:type="dxa" w:w="40"/>
               <w:left w:type="dxa" w:w="80"/>
@@ -2028,7 +2028,7 @@
         </w:tc>
         <w:tc>
           <w:tcPr>
-            <w:tcW w:type="dxa" w:w="1455"/>
+            <w:tcW w:type="dxa" w:w="1443"/>
             <w:tcMar>
               <w:top w:type="dxa" w:w="40"/>
               <w:left w:type="dxa" w:w="80"/>
@@ -2049,7 +2049,7 @@
         </w:tc>
         <w:tc>
           <w:tcPr>
-            <w:tcW w:type="dxa" w:w="1245"/>
+            <w:tcW w:type="dxa" w:w="1250"/>
             <w:tcMar>
               <w:top w:type="dxa" w:w="40"/>
               <w:left w:type="dxa" w:w="80"/>
@@ -2070,7 +2070,7 @@
         </w:tc>
         <w:tc>
           <w:tcPr>
-            <w:tcW w:type="dxa" w:w="2130"/>
+            <w:tcW w:type="dxa" w:w="2102"/>
             <w:tcMar>
               <w:top w:type="dxa" w:w="40"/>
               <w:left w:type="dxa" w:w="80"/>
@@ -3366,22 +3366,7 @@
     </w:p>
     <w:p>
       <w:r>
-        <w:t xml:space="preserve">La figure 5.9 montre comment les gains évoluent. Ceux de l'ELM-PID passent de 1,47, 1,06 et 1,15 fois ceux de Ziegler-Nichols à 50 ms, à 2,48, 1,83 et 1,22 fois à 100 ms, puis à 3,37, 2,07 et 1,35 fois en fin d'essai. L'ELM-PID monte surtout les gains proportionnel et intégral, et presque pas le gain dérivé. La figure donne aussi les gains des autres méthodes, discutés à la section 5.4.</w:t>
-      </w:r>
-    </w:p>
-    <w:p>
-      <w:r>
-        <w:t xml:space="preserve">L'adaptation a un coût sur la commande (figure 5.8). Sur la fenêtre de classement de S10, l'ELM-PID est la méthode qui passe le plus de temps avec le rapport cyclique en butée (0,6 % des instants), et la seule qui y touche encore à 175 ms (dernier instant à 175,45 ms, contre environ 160 ms pour le PSO-PID et le PINN-PID, et 53,5 et 52,3 ms pour Ziegler-Nichols et le Fuzzy-PID). Sa variation moyenne du rapport cyclique d'une période à l'autre (0,0041) reste en revanche inférieure à celle du PSO-PID (0,0062). Son résultat est enfin sensible à de très petits écarts du circuit : avec </w:t>
-      </w:r>
-      <w:r>
-        <w:rPr>
-          <w:i/>
-          <w:iCs/>
-        </w:rPr>
-        <w:t xml:space="preserve">L</w:t>
-      </w:r>
-      <w:r>
-        <w:t xml:space="preserve"> augmentée de 0,1 %, son IAE sur S10 passe de 8,63 à 7,88 mV·s, alors que celle des autres méthodes bouge de moins de 2 %. Cette sensibilité ne change pas le verdict face à Ziegler-Nichols, dont l'IAE reste de 709 à 802 % plus élevée selon la version du circuit.</w:t>
+        <w:t xml:space="preserve">La figure 5.8 montre comment les gains évoluent. Ceux de l'ELM-PID passent de 1,47, 1,06 et 1,15 fois ceux de Ziegler-Nichols à 50 ms, à 2,48, 1,83 et 1,22 fois à 100 ms, puis à 3,37, 2,07 et 1,35 fois en fin d'essai. L'ELM-PID monte surtout les gains proportionnel et intégral, et presque pas le gain dérivé. La figure donne aussi les gains des autres méthodes, discutés à la section 5.4.</w:t>
       </w:r>
     </w:p>
     <w:p>
@@ -3392,7 +3377,7 @@
         <w:rPr>
           <w:highlight w:val="yellow"/>
         </w:rPr>
-        <w:t xml:space="preserve">[FIGURE À INSÉRER — fichier : COMPARAISON/figures_chapitre5/Fig5_S10_A_d_ZN_ELM.png]</w:t>
+        <w:t xml:space="preserve">[FIGURE À INSÉRER — fichier : COMPARAISON/figures_chapitre5/Fig5_S10_gains.png]</w:t>
       </w:r>
     </w:p>
     <w:p>
@@ -3400,7 +3385,52 @@
         <w:pStyle w:val="Caption"/>
       </w:pPr>
       <w:r>
-        <w:t xml:space="preserve">Figure 5.8 : Rapport cyclique dans le scénario S10 : PID de Ziegler-Nichols et ELM-PID. (a) Essai complet ; (b) à (e) agrandissements autour de 50, 100, 115 et 130 ms.</w:t>
+        <w:t xml:space="preserve">Figure 5.8 : Gains </w:t>
+      </w:r>
+      <w:r>
+        <w:rPr>
+          <w:i/>
+          <w:iCs/>
+        </w:rPr>
+        <w:t xml:space="preserve">P</w:t>
+      </w:r>
+      <w:r>
+        <w:t xml:space="preserve"> (a), </w:t>
+      </w:r>
+      <w:r>
+        <w:rPr>
+          <w:i/>
+          <w:iCs/>
+        </w:rPr>
+        <w:t xml:space="preserve">I</w:t>
+      </w:r>
+      <w:r>
+        <w:t xml:space="preserve"> (b) et </w:t>
+      </w:r>
+      <w:r>
+        <w:rPr>
+          <w:i/>
+          <w:iCs/>
+        </w:rPr>
+        <w:t xml:space="preserve">D</w:t>
+      </w:r>
+      <w:r>
+        <w:t xml:space="preserve"> (c) rapportés à ceux de Ziegler-Nichols dans le scénario S10, pour les cinq méthodes.</w:t>
+      </w:r>
+    </w:p>
+    <w:p>
+      <w:r>
+        <w:t xml:space="preserve">L'adaptation a un coût sur la commande (figure 5.9). Sur la fenêtre de classement de S10, l'ELM-PID est la méthode qui passe le plus de temps avec le rapport cyclique en butée (0,6 % des instants), et la seule qui y touche encore à 175 ms (dernier instant à 175,45 ms, contre environ 160 ms pour le PSO-PID et le PINN-PID, et 53,5 et 52,3 ms pour Ziegler-Nichols et le Fuzzy-PID). Sa variation moyenne du rapport cyclique d'une période à l'autre (0,0041) reste en revanche inférieure à celle du PSO-PID (0,0062). Son résultat est enfin sensible à de très petits écarts du circuit : avec </w:t>
+      </w:r>
+      <w:r>
+        <w:rPr>
+          <w:i/>
+          <w:iCs/>
+        </w:rPr>
+        <w:t xml:space="preserve">L</w:t>
+      </w:r>
+      <w:r>
+        <w:t xml:space="preserve"> augmentée de 0,1 %, son IAE sur S10 passe de 8,63 à 7,88 mV·s, alors que celle des autres méthodes bouge de moins de 2 %. Cette sensibilité ne change pas le verdict face à Ziegler-Nichols, dont l'IAE reste de 709 à 802 % plus élevée selon la version du circuit.</w:t>
       </w:r>
     </w:p>
     <w:p>
@@ -3411,7 +3441,7 @@
         <w:rPr>
           <w:highlight w:val="yellow"/>
         </w:rPr>
-        <w:t xml:space="preserve">[FIGURE À INSÉRER — fichier : COMPARAISON/figures_chapitre5/Fig5_S10_gains.png]</w:t>
+        <w:t xml:space="preserve">[FIGURE À INSÉRER — fichier : COMPARAISON/figures_chapitre5/Fig5_S10_A_d_ZN_ELM.png]</w:t>
       </w:r>
     </w:p>
     <w:p>
@@ -3419,37 +3449,7 @@
         <w:pStyle w:val="Caption"/>
       </w:pPr>
       <w:r>
-        <w:t xml:space="preserve">Figure 5.9 : Gains </w:t>
-      </w:r>
-      <w:r>
-        <w:rPr>
-          <w:i/>
-          <w:iCs/>
-        </w:rPr>
-        <w:t xml:space="preserve">P</w:t>
-      </w:r>
-      <w:r>
-        <w:t xml:space="preserve"> (a), </w:t>
-      </w:r>
-      <w:r>
-        <w:rPr>
-          <w:i/>
-          <w:iCs/>
-        </w:rPr>
-        <w:t xml:space="preserve">I</w:t>
-      </w:r>
-      <w:r>
-        <w:t xml:space="preserve"> (b) et </w:t>
-      </w:r>
-      <w:r>
-        <w:rPr>
-          <w:i/>
-          <w:iCs/>
-        </w:rPr>
-        <w:t xml:space="preserve">D</w:t>
-      </w:r>
-      <w:r>
-        <w:t xml:space="preserve"> (c) rapportés à ceux de Ziegler-Nichols dans le scénario S10, pour les cinq méthodes.</w:t>
+        <w:t xml:space="preserve">Figure 5.9 : Rapport cyclique dans le scénario S10 : PID de Ziegler-Nichols et ELM-PID. (a) Essai complet ; (b) à (e) agrandissements autour de 50, 100, 115 et 130 ms.</w:t>
       </w:r>
     </w:p>
     <w:p>
@@ -3488,13 +3488,13 @@
         <w:tblLayout w:type="fixed"/>
       </w:tblPr>
       <w:tblGrid>
-        <w:gridCol w:w="731"/>
-        <w:gridCol w:w="966"/>
-        <w:gridCol w:w="1126"/>
-        <w:gridCol w:w="858"/>
-        <w:gridCol w:w="1921"/>
-        <w:gridCol w:w="1547"/>
-        <w:gridCol w:w="1638"/>
+        <w:gridCol w:w="1040"/>
+        <w:gridCol w:w="923"/>
+        <w:gridCol w:w="1065"/>
+        <w:gridCol w:w="1250"/>
+        <w:gridCol w:w="1708"/>
+        <w:gridCol w:w="1353"/>
+        <w:gridCol w:w="1448"/>
       </w:tblGrid>
       <w:tr>
         <w:trPr>
@@ -3503,7 +3503,7 @@
         </w:trPr>
         <w:tc>
           <w:tcPr>
-            <w:tcW w:type="dxa" w:w="731"/>
+            <w:tcW w:type="dxa" w:w="1040"/>
             <w:tcMar>
               <w:top w:type="dxa" w:w="40"/>
               <w:left w:type="dxa" w:w="80"/>
@@ -3528,7 +3528,7 @@
         </w:tc>
         <w:tc>
           <w:tcPr>
-            <w:tcW w:type="dxa" w:w="966"/>
+            <w:tcW w:type="dxa" w:w="923"/>
             <w:tcMar>
               <w:top w:type="dxa" w:w="40"/>
               <w:left w:type="dxa" w:w="80"/>
@@ -3553,7 +3553,7 @@
         </w:tc>
         <w:tc>
           <w:tcPr>
-            <w:tcW w:type="dxa" w:w="1126"/>
+            <w:tcW w:type="dxa" w:w="1065"/>
             <w:tcMar>
               <w:top w:type="dxa" w:w="40"/>
               <w:left w:type="dxa" w:w="80"/>
@@ -3578,7 +3578,7 @@
         </w:tc>
         <w:tc>
           <w:tcPr>
-            <w:tcW w:type="dxa" w:w="858"/>
+            <w:tcW w:type="dxa" w:w="1250"/>
             <w:tcMar>
               <w:top w:type="dxa" w:w="40"/>
               <w:left w:type="dxa" w:w="80"/>
@@ -3603,7 +3603,7 @@
         </w:tc>
         <w:tc>
           <w:tcPr>
-            <w:tcW w:type="dxa" w:w="1921"/>
+            <w:tcW w:type="dxa" w:w="1708"/>
             <w:tcMar>
               <w:top w:type="dxa" w:w="40"/>
               <w:left w:type="dxa" w:w="80"/>
@@ -3628,7 +3628,7 @@
         </w:tc>
         <w:tc>
           <w:tcPr>
-            <w:tcW w:type="dxa" w:w="1547"/>
+            <w:tcW w:type="dxa" w:w="1353"/>
             <w:tcMar>
               <w:top w:type="dxa" w:w="40"/>
               <w:left w:type="dxa" w:w="80"/>
@@ -3653,7 +3653,7 @@
         </w:tc>
         <w:tc>
           <w:tcPr>
-            <w:tcW w:type="dxa" w:w="1638"/>
+            <w:tcW w:type="dxa" w:w="1448"/>
             <w:tcMar>
               <w:top w:type="dxa" w:w="40"/>
               <w:left w:type="dxa" w:w="80"/>
@@ -3684,7 +3684,7 @@
         </w:trPr>
         <w:tc>
           <w:tcPr>
-            <w:tcW w:type="dxa" w:w="731"/>
+            <w:tcW w:type="dxa" w:w="1040"/>
             <w:tcMar>
               <w:top w:type="dxa" w:w="40"/>
               <w:left w:type="dxa" w:w="80"/>
@@ -3705,7 +3705,7 @@
         </w:tc>
         <w:tc>
           <w:tcPr>
-            <w:tcW w:type="dxa" w:w="966"/>
+            <w:tcW w:type="dxa" w:w="923"/>
             <w:tcMar>
               <w:top w:type="dxa" w:w="40"/>
               <w:left w:type="dxa" w:w="80"/>
@@ -3726,7 +3726,7 @@
         </w:tc>
         <w:tc>
           <w:tcPr>
-            <w:tcW w:type="dxa" w:w="1126"/>
+            <w:tcW w:type="dxa" w:w="1065"/>
             <w:tcMar>
               <w:top w:type="dxa" w:w="40"/>
               <w:left w:type="dxa" w:w="80"/>
@@ -3747,7 +3747,7 @@
         </w:tc>
         <w:tc>
           <w:tcPr>
-            <w:tcW w:type="dxa" w:w="858"/>
+            <w:tcW w:type="dxa" w:w="1250"/>
             <w:tcMar>
               <w:top w:type="dxa" w:w="40"/>
               <w:left w:type="dxa" w:w="80"/>
@@ -3768,7 +3768,7 @@
         </w:tc>
         <w:tc>
           <w:tcPr>
-            <w:tcW w:type="dxa" w:w="1921"/>
+            <w:tcW w:type="dxa" w:w="1708"/>
             <w:tcMar>
               <w:top w:type="dxa" w:w="40"/>
               <w:left w:type="dxa" w:w="80"/>
@@ -3789,7 +3789,7 @@
         </w:tc>
         <w:tc>
           <w:tcPr>
-            <w:tcW w:type="dxa" w:w="1547"/>
+            <w:tcW w:type="dxa" w:w="1353"/>
             <w:tcMar>
               <w:top w:type="dxa" w:w="40"/>
               <w:left w:type="dxa" w:w="80"/>
@@ -3810,7 +3810,7 @@
         </w:tc>
         <w:tc>
           <w:tcPr>
-            <w:tcW w:type="dxa" w:w="1638"/>
+            <w:tcW w:type="dxa" w:w="1448"/>
             <w:tcMar>
               <w:top w:type="dxa" w:w="40"/>
               <w:left w:type="dxa" w:w="80"/>
@@ -3837,7 +3837,7 @@
         </w:trPr>
         <w:tc>
           <w:tcPr>
-            <w:tcW w:type="dxa" w:w="731"/>
+            <w:tcW w:type="dxa" w:w="1040"/>
             <w:tcMar>
               <w:top w:type="dxa" w:w="40"/>
               <w:left w:type="dxa" w:w="80"/>
@@ -3858,7 +3858,7 @@
         </w:tc>
         <w:tc>
           <w:tcPr>
-            <w:tcW w:type="dxa" w:w="966"/>
+            <w:tcW w:type="dxa" w:w="923"/>
             <w:tcMar>
               <w:top w:type="dxa" w:w="40"/>
               <w:left w:type="dxa" w:w="80"/>
@@ -3879,7 +3879,7 @@
         </w:tc>
         <w:tc>
           <w:tcPr>
-            <w:tcW w:type="dxa" w:w="1126"/>
+            <w:tcW w:type="dxa" w:w="1065"/>
             <w:tcMar>
               <w:top w:type="dxa" w:w="40"/>
               <w:left w:type="dxa" w:w="80"/>
@@ -3900,7 +3900,7 @@
         </w:tc>
         <w:tc>
           <w:tcPr>
-            <w:tcW w:type="dxa" w:w="858"/>
+            <w:tcW w:type="dxa" w:w="1250"/>
             <w:tcMar>
               <w:top w:type="dxa" w:w="40"/>
               <w:left w:type="dxa" w:w="80"/>
@@ -3921,7 +3921,7 @@
         </w:tc>
         <w:tc>
           <w:tcPr>
-            <w:tcW w:type="dxa" w:w="1921"/>
+            <w:tcW w:type="dxa" w:w="1708"/>
             <w:tcMar>
               <w:top w:type="dxa" w:w="40"/>
               <w:left w:type="dxa" w:w="80"/>
@@ -3942,7 +3942,7 @@
         </w:tc>
         <w:tc>
           <w:tcPr>
-            <w:tcW w:type="dxa" w:w="1547"/>
+            <w:tcW w:type="dxa" w:w="1353"/>
             <w:tcMar>
               <w:top w:type="dxa" w:w="40"/>
               <w:left w:type="dxa" w:w="80"/>
@@ -3963,7 +3963,7 @@
         </w:tc>
         <w:tc>
           <w:tcPr>
-            <w:tcW w:type="dxa" w:w="1638"/>
+            <w:tcW w:type="dxa" w:w="1448"/>
             <w:tcMar>
               <w:top w:type="dxa" w:w="40"/>
               <w:left w:type="dxa" w:w="80"/>
@@ -3990,7 +3990,7 @@
         </w:trPr>
         <w:tc>
           <w:tcPr>
-            <w:tcW w:type="dxa" w:w="731"/>
+            <w:tcW w:type="dxa" w:w="1040"/>
             <w:tcMar>
               <w:top w:type="dxa" w:w="40"/>
               <w:left w:type="dxa" w:w="80"/>
@@ -4011,7 +4011,7 @@
         </w:tc>
         <w:tc>
           <w:tcPr>
-            <w:tcW w:type="dxa" w:w="966"/>
+            <w:tcW w:type="dxa" w:w="923"/>
             <w:tcMar>
               <w:top w:type="dxa" w:w="40"/>
               <w:left w:type="dxa" w:w="80"/>
@@ -4032,7 +4032,7 @@
         </w:tc>
         <w:tc>
           <w:tcPr>
-            <w:tcW w:type="dxa" w:w="1126"/>
+            <w:tcW w:type="dxa" w:w="1065"/>
             <w:tcMar>
               <w:top w:type="dxa" w:w="40"/>
               <w:left w:type="dxa" w:w="80"/>
@@ -4053,7 +4053,7 @@
         </w:tc>
         <w:tc>
           <w:tcPr>
-            <w:tcW w:type="dxa" w:w="858"/>
+            <w:tcW w:type="dxa" w:w="1250"/>
             <w:tcMar>
               <w:top w:type="dxa" w:w="40"/>
               <w:left w:type="dxa" w:w="80"/>
@@ -4074,7 +4074,7 @@
         </w:tc>
         <w:tc>
           <w:tcPr>
-            <w:tcW w:type="dxa" w:w="1921"/>
+            <w:tcW w:type="dxa" w:w="1708"/>
             <w:tcMar>
               <w:top w:type="dxa" w:w="40"/>
               <w:left w:type="dxa" w:w="80"/>
@@ -4095,7 +4095,7 @@
         </w:tc>
         <w:tc>
           <w:tcPr>
-            <w:tcW w:type="dxa" w:w="1547"/>
+            <w:tcW w:type="dxa" w:w="1353"/>
             <w:tcMar>
               <w:top w:type="dxa" w:w="40"/>
               <w:left w:type="dxa" w:w="80"/>
@@ -4116,7 +4116,7 @@
         </w:tc>
         <w:tc>
           <w:tcPr>
-            <w:tcW w:type="dxa" w:w="1638"/>
+            <w:tcW w:type="dxa" w:w="1448"/>
             <w:tcMar>
               <w:top w:type="dxa" w:w="40"/>
               <w:left w:type="dxa" w:w="80"/>
@@ -4143,7 +4143,7 @@
         </w:trPr>
         <w:tc>
           <w:tcPr>
-            <w:tcW w:type="dxa" w:w="731"/>
+            <w:tcW w:type="dxa" w:w="1040"/>
             <w:tcMar>
               <w:top w:type="dxa" w:w="40"/>
               <w:left w:type="dxa" w:w="80"/>
@@ -4164,7 +4164,7 @@
         </w:tc>
         <w:tc>
           <w:tcPr>
-            <w:tcW w:type="dxa" w:w="966"/>
+            <w:tcW w:type="dxa" w:w="923"/>
             <w:tcMar>
               <w:top w:type="dxa" w:w="40"/>
               <w:left w:type="dxa" w:w="80"/>
@@ -4185,7 +4185,7 @@
         </w:tc>
         <w:tc>
           <w:tcPr>
-            <w:tcW w:type="dxa" w:w="1126"/>
+            <w:tcW w:type="dxa" w:w="1065"/>
             <w:tcMar>
               <w:top w:type="dxa" w:w="40"/>
               <w:left w:type="dxa" w:w="80"/>
@@ -4206,7 +4206,7 @@
         </w:tc>
         <w:tc>
           <w:tcPr>
-            <w:tcW w:type="dxa" w:w="858"/>
+            <w:tcW w:type="dxa" w:w="1250"/>
             <w:tcMar>
               <w:top w:type="dxa" w:w="40"/>
               <w:left w:type="dxa" w:w="80"/>
@@ -4227,7 +4227,7 @@
         </w:tc>
         <w:tc>
           <w:tcPr>
-            <w:tcW w:type="dxa" w:w="1921"/>
+            <w:tcW w:type="dxa" w:w="1708"/>
             <w:tcMar>
               <w:top w:type="dxa" w:w="40"/>
               <w:left w:type="dxa" w:w="80"/>
@@ -4248,7 +4248,7 @@
         </w:tc>
         <w:tc>
           <w:tcPr>
-            <w:tcW w:type="dxa" w:w="1547"/>
+            <w:tcW w:type="dxa" w:w="1353"/>
             <w:tcMar>
               <w:top w:type="dxa" w:w="40"/>
               <w:left w:type="dxa" w:w="80"/>
@@ -4269,7 +4269,7 @@
         </w:tc>
         <w:tc>
           <w:tcPr>
-            <w:tcW w:type="dxa" w:w="1638"/>
+            <w:tcW w:type="dxa" w:w="1448"/>
             <w:tcMar>
               <w:top w:type="dxa" w:w="40"/>
               <w:left w:type="dxa" w:w="80"/>
@@ -4296,7 +4296,7 @@
         </w:trPr>
         <w:tc>
           <w:tcPr>
-            <w:tcW w:type="dxa" w:w="731"/>
+            <w:tcW w:type="dxa" w:w="1040"/>
             <w:tcMar>
               <w:top w:type="dxa" w:w="40"/>
               <w:left w:type="dxa" w:w="80"/>
@@ -4317,7 +4317,7 @@
         </w:tc>
         <w:tc>
           <w:tcPr>
-            <w:tcW w:type="dxa" w:w="966"/>
+            <w:tcW w:type="dxa" w:w="923"/>
             <w:tcMar>
               <w:top w:type="dxa" w:w="40"/>
               <w:left w:type="dxa" w:w="80"/>
@@ -4338,7 +4338,7 @@
         </w:tc>
         <w:tc>
           <w:tcPr>
-            <w:tcW w:type="dxa" w:w="1126"/>
+            <w:tcW w:type="dxa" w:w="1065"/>
             <w:tcMar>
               <w:top w:type="dxa" w:w="40"/>
               <w:left w:type="dxa" w:w="80"/>
@@ -4359,7 +4359,7 @@
         </w:tc>
         <w:tc>
           <w:tcPr>
-            <w:tcW w:type="dxa" w:w="858"/>
+            <w:tcW w:type="dxa" w:w="1250"/>
             <w:tcMar>
               <w:top w:type="dxa" w:w="40"/>
               <w:left w:type="dxa" w:w="80"/>
@@ -4380,7 +4380,7 @@
         </w:tc>
         <w:tc>
           <w:tcPr>
-            <w:tcW w:type="dxa" w:w="1921"/>
+            <w:tcW w:type="dxa" w:w="1708"/>
             <w:tcMar>
               <w:top w:type="dxa" w:w="40"/>
               <w:left w:type="dxa" w:w="80"/>
@@ -4401,7 +4401,7 @@
         </w:tc>
         <w:tc>
           <w:tcPr>
-            <w:tcW w:type="dxa" w:w="1547"/>
+            <w:tcW w:type="dxa" w:w="1353"/>
             <w:tcMar>
               <w:top w:type="dxa" w:w="40"/>
               <w:left w:type="dxa" w:w="80"/>
@@ -4422,7 +4422,7 @@
         </w:tc>
         <w:tc>
           <w:tcPr>
-            <w:tcW w:type="dxa" w:w="1638"/>
+            <w:tcW w:type="dxa" w:w="1448"/>
             <w:tcMar>
               <w:top w:type="dxa" w:w="40"/>
               <w:left w:type="dxa" w:w="80"/>
@@ -4520,13 +4520,13 @@
         <w:tblLayout w:type="fixed"/>
       </w:tblPr>
       <w:tblGrid>
-        <w:gridCol w:w="898"/>
-        <w:gridCol w:w="747"/>
-        <w:gridCol w:w="877"/>
-        <w:gridCol w:w="992"/>
-        <w:gridCol w:w="877"/>
-        <w:gridCol w:w="934"/>
-        <w:gridCol w:w="3462"/>
+        <w:gridCol w:w="1040"/>
+        <w:gridCol w:w="742"/>
+        <w:gridCol w:w="935"/>
+        <w:gridCol w:w="1145"/>
+        <w:gridCol w:w="935"/>
+        <w:gridCol w:w="1040"/>
+        <w:gridCol w:w="2950"/>
       </w:tblGrid>
       <w:tr>
         <w:trPr>
@@ -4535,7 +4535,7 @@
         </w:trPr>
         <w:tc>
           <w:tcPr>
-            <w:tcW w:type="dxa" w:w="898"/>
+            <w:tcW w:type="dxa" w:w="1040"/>
             <w:tcMar>
               <w:top w:type="dxa" w:w="40"/>
               <w:left w:type="dxa" w:w="80"/>
@@ -4560,7 +4560,7 @@
         </w:tc>
         <w:tc>
           <w:tcPr>
-            <w:tcW w:type="dxa" w:w="747"/>
+            <w:tcW w:type="dxa" w:w="742"/>
             <w:tcMar>
               <w:top w:type="dxa" w:w="40"/>
               <w:left w:type="dxa" w:w="80"/>
@@ -4585,7 +4585,7 @@
         </w:tc>
         <w:tc>
           <w:tcPr>
-            <w:tcW w:type="dxa" w:w="877"/>
+            <w:tcW w:type="dxa" w:w="935"/>
             <w:tcMar>
               <w:top w:type="dxa" w:w="40"/>
               <w:left w:type="dxa" w:w="80"/>
@@ -4610,7 +4610,7 @@
         </w:tc>
         <w:tc>
           <w:tcPr>
-            <w:tcW w:type="dxa" w:w="992"/>
+            <w:tcW w:type="dxa" w:w="1145"/>
             <w:tcMar>
               <w:top w:type="dxa" w:w="40"/>
               <w:left w:type="dxa" w:w="80"/>
@@ -4635,7 +4635,7 @@
         </w:tc>
         <w:tc>
           <w:tcPr>
-            <w:tcW w:type="dxa" w:w="877"/>
+            <w:tcW w:type="dxa" w:w="935"/>
             <w:tcMar>
               <w:top w:type="dxa" w:w="40"/>
               <w:left w:type="dxa" w:w="80"/>
@@ -4660,7 +4660,7 @@
         </w:tc>
         <w:tc>
           <w:tcPr>
-            <w:tcW w:type="dxa" w:w="934"/>
+            <w:tcW w:type="dxa" w:w="1040"/>
             <w:tcMar>
               <w:top w:type="dxa" w:w="40"/>
               <w:left w:type="dxa" w:w="80"/>
@@ -4685,7 +4685,7 @@
         </w:tc>
         <w:tc>
           <w:tcPr>
-            <w:tcW w:type="dxa" w:w="3462"/>
+            <w:tcW w:type="dxa" w:w="2950"/>
             <w:tcMar>
               <w:top w:type="dxa" w:w="40"/>
               <w:left w:type="dxa" w:w="80"/>
@@ -4716,7 +4716,7 @@
         </w:trPr>
         <w:tc>
           <w:tcPr>
-            <w:tcW w:type="dxa" w:w="898"/>
+            <w:tcW w:type="dxa" w:w="1040"/>
             <w:tcMar>
               <w:top w:type="dxa" w:w="40"/>
               <w:left w:type="dxa" w:w="80"/>
@@ -4737,7 +4737,7 @@
         </w:tc>
         <w:tc>
           <w:tcPr>
-            <w:tcW w:type="dxa" w:w="747"/>
+            <w:tcW w:type="dxa" w:w="742"/>
             <w:tcMar>
               <w:top w:type="dxa" w:w="40"/>
               <w:left w:type="dxa" w:w="80"/>
@@ -4758,7 +4758,7 @@
         </w:tc>
         <w:tc>
           <w:tcPr>
-            <w:tcW w:type="dxa" w:w="877"/>
+            <w:tcW w:type="dxa" w:w="935"/>
             <w:tcMar>
               <w:top w:type="dxa" w:w="40"/>
               <w:left w:type="dxa" w:w="80"/>
@@ -4779,7 +4779,7 @@
         </w:tc>
         <w:tc>
           <w:tcPr>
-            <w:tcW w:type="dxa" w:w="992"/>
+            <w:tcW w:type="dxa" w:w="1145"/>
             <w:tcMar>
               <w:top w:type="dxa" w:w="40"/>
               <w:left w:type="dxa" w:w="80"/>
@@ -4800,7 +4800,7 @@
         </w:tc>
         <w:tc>
           <w:tcPr>
-            <w:tcW w:type="dxa" w:w="877"/>
+            <w:tcW w:type="dxa" w:w="935"/>
             <w:tcMar>
               <w:top w:type="dxa" w:w="40"/>
               <w:left w:type="dxa" w:w="80"/>
@@ -4821,7 +4821,7 @@
         </w:tc>
         <w:tc>
           <w:tcPr>
-            <w:tcW w:type="dxa" w:w="934"/>
+            <w:tcW w:type="dxa" w:w="1040"/>
             <w:tcMar>
               <w:top w:type="dxa" w:w="40"/>
               <w:left w:type="dxa" w:w="80"/>
@@ -4842,7 +4842,7 @@
         </w:tc>
         <w:tc>
           <w:tcPr>
-            <w:tcW w:type="dxa" w:w="3462"/>
+            <w:tcW w:type="dxa" w:w="2950"/>
             <w:tcMar>
               <w:top w:type="dxa" w:w="40"/>
               <w:left w:type="dxa" w:w="80"/>
@@ -4869,7 +4869,7 @@
         </w:trPr>
         <w:tc>
           <w:tcPr>
-            <w:tcW w:type="dxa" w:w="898"/>
+            <w:tcW w:type="dxa" w:w="1040"/>
             <w:tcMar>
               <w:top w:type="dxa" w:w="40"/>
               <w:left w:type="dxa" w:w="80"/>
@@ -4890,7 +4890,7 @@
         </w:tc>
         <w:tc>
           <w:tcPr>
-            <w:tcW w:type="dxa" w:w="747"/>
+            <w:tcW w:type="dxa" w:w="742"/>
             <w:tcMar>
               <w:top w:type="dxa" w:w="40"/>
               <w:left w:type="dxa" w:w="80"/>
@@ -4911,7 +4911,7 @@
         </w:tc>
         <w:tc>
           <w:tcPr>
-            <w:tcW w:type="dxa" w:w="877"/>
+            <w:tcW w:type="dxa" w:w="935"/>
             <w:tcMar>
               <w:top w:type="dxa" w:w="40"/>
               <w:left w:type="dxa" w:w="80"/>
@@ -4932,7 +4932,7 @@
         </w:tc>
         <w:tc>
           <w:tcPr>
-            <w:tcW w:type="dxa" w:w="992"/>
+            <w:tcW w:type="dxa" w:w="1145"/>
             <w:tcMar>
               <w:top w:type="dxa" w:w="40"/>
               <w:left w:type="dxa" w:w="80"/>
@@ -4953,7 +4953,7 @@
         </w:tc>
         <w:tc>
           <w:tcPr>
-            <w:tcW w:type="dxa" w:w="877"/>
+            <w:tcW w:type="dxa" w:w="935"/>
             <w:tcMar>
               <w:top w:type="dxa" w:w="40"/>
               <w:left w:type="dxa" w:w="80"/>
@@ -4974,7 +4974,7 @@
         </w:tc>
         <w:tc>
           <w:tcPr>
-            <w:tcW w:type="dxa" w:w="934"/>
+            <w:tcW w:type="dxa" w:w="1040"/>
             <w:tcMar>
               <w:top w:type="dxa" w:w="40"/>
               <w:left w:type="dxa" w:w="80"/>
@@ -4995,7 +4995,7 @@
         </w:tc>
         <w:tc>
           <w:tcPr>
-            <w:tcW w:type="dxa" w:w="3462"/>
+            <w:tcW w:type="dxa" w:w="2950"/>
             <w:tcMar>
               <w:top w:type="dxa" w:w="40"/>
               <w:left w:type="dxa" w:w="80"/>
@@ -5022,7 +5022,7 @@
         </w:trPr>
         <w:tc>
           <w:tcPr>
-            <w:tcW w:type="dxa" w:w="898"/>
+            <w:tcW w:type="dxa" w:w="1040"/>
             <w:tcMar>
               <w:top w:type="dxa" w:w="40"/>
               <w:left w:type="dxa" w:w="80"/>
@@ -5043,7 +5043,7 @@
         </w:tc>
         <w:tc>
           <w:tcPr>
-            <w:tcW w:type="dxa" w:w="747"/>
+            <w:tcW w:type="dxa" w:w="742"/>
             <w:tcMar>
               <w:top w:type="dxa" w:w="40"/>
               <w:left w:type="dxa" w:w="80"/>
@@ -5064,7 +5064,7 @@
         </w:tc>
         <w:tc>
           <w:tcPr>
-            <w:tcW w:type="dxa" w:w="877"/>
+            <w:tcW w:type="dxa" w:w="935"/>
             <w:tcMar>
               <w:top w:type="dxa" w:w="40"/>
               <w:left w:type="dxa" w:w="80"/>
@@ -5085,7 +5085,7 @@
         </w:tc>
         <w:tc>
           <w:tcPr>
-            <w:tcW w:type="dxa" w:w="992"/>
+            <w:tcW w:type="dxa" w:w="1145"/>
             <w:tcMar>
               <w:top w:type="dxa" w:w="40"/>
               <w:left w:type="dxa" w:w="80"/>
@@ -5106,7 +5106,7 @@
         </w:tc>
         <w:tc>
           <w:tcPr>
-            <w:tcW w:type="dxa" w:w="877"/>
+            <w:tcW w:type="dxa" w:w="935"/>
             <w:tcMar>
               <w:top w:type="dxa" w:w="40"/>
               <w:left w:type="dxa" w:w="80"/>
@@ -5127,7 +5127,7 @@
         </w:tc>
         <w:tc>
           <w:tcPr>
-            <w:tcW w:type="dxa" w:w="934"/>
+            <w:tcW w:type="dxa" w:w="1040"/>
             <w:tcMar>
               <w:top w:type="dxa" w:w="40"/>
               <w:left w:type="dxa" w:w="80"/>
@@ -5148,7 +5148,7 @@
         </w:tc>
         <w:tc>
           <w:tcPr>
-            <w:tcW w:type="dxa" w:w="3462"/>
+            <w:tcW w:type="dxa" w:w="2950"/>
             <w:tcMar>
               <w:top w:type="dxa" w:w="40"/>
               <w:left w:type="dxa" w:w="80"/>
@@ -5175,7 +5175,7 @@
         </w:trPr>
         <w:tc>
           <w:tcPr>
-            <w:tcW w:type="dxa" w:w="898"/>
+            <w:tcW w:type="dxa" w:w="1040"/>
             <w:tcMar>
               <w:top w:type="dxa" w:w="40"/>
               <w:left w:type="dxa" w:w="80"/>
@@ -5196,7 +5196,7 @@
         </w:tc>
         <w:tc>
           <w:tcPr>
-            <w:tcW w:type="dxa" w:w="747"/>
+            <w:tcW w:type="dxa" w:w="742"/>
             <w:tcMar>
               <w:top w:type="dxa" w:w="40"/>
               <w:left w:type="dxa" w:w="80"/>
@@ -5217,7 +5217,7 @@
         </w:tc>
         <w:tc>
           <w:tcPr>
-            <w:tcW w:type="dxa" w:w="877"/>
+            <w:tcW w:type="dxa" w:w="935"/>
             <w:tcMar>
               <w:top w:type="dxa" w:w="40"/>
               <w:left w:type="dxa" w:w="80"/>
@@ -5238,7 +5238,7 @@
         </w:tc>
         <w:tc>
           <w:tcPr>
-            <w:tcW w:type="dxa" w:w="992"/>
+            <w:tcW w:type="dxa" w:w="1145"/>
             <w:tcMar>
               <w:top w:type="dxa" w:w="40"/>
               <w:left w:type="dxa" w:w="80"/>
@@ -5259,7 +5259,7 @@
         </w:tc>
         <w:tc>
           <w:tcPr>
-            <w:tcW w:type="dxa" w:w="877"/>
+            <w:tcW w:type="dxa" w:w="935"/>
             <w:tcMar>
               <w:top w:type="dxa" w:w="40"/>
               <w:left w:type="dxa" w:w="80"/>
@@ -5280,7 +5280,7 @@
         </w:tc>
         <w:tc>
           <w:tcPr>
-            <w:tcW w:type="dxa" w:w="934"/>
+            <w:tcW w:type="dxa" w:w="1040"/>
             <w:tcMar>
               <w:top w:type="dxa" w:w="40"/>
               <w:left w:type="dxa" w:w="80"/>
@@ -5301,7 +5301,7 @@
         </w:tc>
         <w:tc>
           <w:tcPr>
-            <w:tcW w:type="dxa" w:w="3462"/>
+            <w:tcW w:type="dxa" w:w="2950"/>
             <w:tcMar>
               <w:top w:type="dxa" w:w="40"/>
               <w:left w:type="dxa" w:w="80"/>
@@ -5328,7 +5328,7 @@
         </w:trPr>
         <w:tc>
           <w:tcPr>
-            <w:tcW w:type="dxa" w:w="898"/>
+            <w:tcW w:type="dxa" w:w="1040"/>
             <w:tcMar>
               <w:top w:type="dxa" w:w="40"/>
               <w:left w:type="dxa" w:w="80"/>
@@ -5349,7 +5349,7 @@
         </w:tc>
         <w:tc>
           <w:tcPr>
-            <w:tcW w:type="dxa" w:w="747"/>
+            <w:tcW w:type="dxa" w:w="742"/>
             <w:tcMar>
               <w:top w:type="dxa" w:w="40"/>
               <w:left w:type="dxa" w:w="80"/>
@@ -5370,7 +5370,7 @@
         </w:tc>
         <w:tc>
           <w:tcPr>
-            <w:tcW w:type="dxa" w:w="877"/>
+            <w:tcW w:type="dxa" w:w="935"/>
             <w:tcMar>
               <w:top w:type="dxa" w:w="40"/>
               <w:left w:type="dxa" w:w="80"/>
@@ -5391,7 +5391,7 @@
         </w:tc>
         <w:tc>
           <w:tcPr>
-            <w:tcW w:type="dxa" w:w="992"/>
+            <w:tcW w:type="dxa" w:w="1145"/>
             <w:tcMar>
               <w:top w:type="dxa" w:w="40"/>
               <w:left w:type="dxa" w:w="80"/>
@@ -5412,7 +5412,7 @@
         </w:tc>
         <w:tc>
           <w:tcPr>
-            <w:tcW w:type="dxa" w:w="877"/>
+            <w:tcW w:type="dxa" w:w="935"/>
             <w:tcMar>
               <w:top w:type="dxa" w:w="40"/>
               <w:left w:type="dxa" w:w="80"/>
@@ -5433,7 +5433,7 @@
         </w:tc>
         <w:tc>
           <w:tcPr>
-            <w:tcW w:type="dxa" w:w="934"/>
+            <w:tcW w:type="dxa" w:w="1040"/>
             <w:tcMar>
               <w:top w:type="dxa" w:w="40"/>
               <w:left w:type="dxa" w:w="80"/>
@@ -5454,7 +5454,7 @@
         </w:tc>
         <w:tc>
           <w:tcPr>
-            <w:tcW w:type="dxa" w:w="3462"/>
+            <w:tcW w:type="dxa" w:w="2950"/>
             <w:tcMar>
               <w:top w:type="dxa" w:w="40"/>
               <w:left w:type="dxa" w:w="80"/>
@@ -5480,7 +5480,12 @@
         <w:spacing w:before="240"/>
       </w:pPr>
       <w:r>
-        <w:t xml:space="preserve">Le PSO-PID a la plus petite IAE sur les cinq scénarios, et il est séparé de toutes les autres méthodes partout. Les sous-sections qui suivent reprennent chaque scénario.</w:t>
+        <w:t xml:space="preserve">Le PSO-PID a la plus petite IAE sur les cinq scénarios, et il est séparé de toutes les autres méthodes partout. Les paragraphes qui suivent reprennent chaque scénario.</w:t>
+      </w:r>
+    </w:p>
+    <w:p>
+      <w:r>
+        <w:t xml:space="preserve">Sur S1 (figures 5.10 et 5.11), le PSO-PID a le plus petit dépassement (7,06 %) et l'établissement le plus rapide (2,64 ms). Suivent le PINN-PID (13,20 % ; 2,70 ms) et l'ELM-PID (13,99 % ; 3,40 ms). Le Fuzzy-PID dépasse de 27,34 % et s'établit en 3,35 ms ; c'est aussi lui dont le rapport cyclique reste le plus longtemps en butée pendant la montée (2,250 ms au total, la dernière fois à 2,605 ms, contre 1,6 à 1,8 ms pour les trois autres).</w:t>
       </w:r>
     </w:p>
     <w:p>
@@ -5523,7 +5528,7 @@
     </w:p>
     <w:p>
       <w:r>
-        <w:t xml:space="preserve">Sur S1 (figures 5.10 et 5.11), le PSO-PID a le plus petit dépassement (7,06 %) et l'établissement le plus rapide (2,64 ms). Suivent le PINN-PID (13,20 % ; 2,70 ms) et l'ELM-PID (13,99 % ; 3,40 ms). Le Fuzzy-PID dépasse de 27,34 % et s'établit en 3,35 ms ; c'est aussi lui dont le rapport cyclique reste le plus longtemps en butée pendant la montée (2,250 ms au total, la dernière fois à 2,605 ms, contre 1,6 à 1,8 ms pour les trois autres).</w:t>
+        <w:t xml:space="preserve">Sur S2 (figure 5.12), l'ELM-PID, le Fuzzy-PID et le PINN-PID sont à moins de 1,4 % l'un de l'autre. La règle ne sépare ni l'ELM-PID du PINN-PID (écart de −0,22 à +1,90 % selon la version du circuit) ni le Fuzzy-PID du PINN-PID (−1,14 à +0,51 %), mais elle sépare l'ELM-PID du Fuzzy-PID (+0,76 à +1,38 %). La relation n'est donc pas transitive, et aucun groupe ne peut être formé ; en pratique, les trois méthodes sont au même niveau. Le PSO-PID fait 15 % de moins que l'ELM-PID (2,04 contre 2,41 mV·s).</w:t>
       </w:r>
     </w:p>
     <w:p>
@@ -5547,7 +5552,7 @@
     </w:p>
     <w:p>
       <w:r>
-        <w:t xml:space="preserve">Sur S2 (figure 5.12), l'ELM-PID, le Fuzzy-PID et le PINN-PID sont à moins de 1,4 % l'un de l'autre. La règle ne sépare ni l'ELM-PID du PINN-PID (écart de −0,22 à +1,90 % selon la version du circuit) ni le Fuzzy-PID du PINN-PID (−1,14 à +0,51 %), mais elle sépare l'ELM-PID du Fuzzy-PID (+0,76 à +1,38 %). La relation n'est donc pas transitive, et aucun groupe ne peut être formé ; en pratique, les trois méthodes sont au même niveau. Le PSO-PID fait 15 % de moins que l'ELM-PID (2,04 contre 2,41 mV·s).</w:t>
+        <w:t xml:space="preserve">Sur S3 (figure 5.13), l'ELM-PID et le PINN-PID ne sont pas séparés (6,41 et 6,40 mV·s). Le PSO-PID obtient 5,46 mV·s. Au premier échelon de charge, l'écart maximal est le même pour toutes les méthodes (5,52 V) ; au retour de la charge à 70 ms, il vaut 5,43 V pour le PSO-PID contre 5,66 V pour l'ELM-PID, le Fuzzy-PID et le PINN-PID.</w:t>
       </w:r>
     </w:p>
     <w:p>
@@ -5571,7 +5576,7 @@
     </w:p>
     <w:p>
       <w:r>
-        <w:t xml:space="preserve">Sur S3 (figure 5.13), l'ELM-PID et le PINN-PID ne sont pas séparés (6,41 et 6,40 mV·s). Le PSO-PID obtient 5,46 mV·s. Au premier échelon de charge, l'écart maximal est le même pour toutes les méthodes (5,52 V) ; au retour de la charge à 70 ms, il vaut 5,43 V pour le PSO-PID contre 5,66 V pour l'ELM-PID, le Fuzzy-PID et le PINN-PID.</w:t>
+        <w:t xml:space="preserve">Sur S8a (figure 5.14), le PINN-PID devance l'ELM-PID de 0,4 %. L'ordre est le même dans les cinq versions du circuit (écart de 0,13 à 1,24 %), mais un tel écart n'a pas de poids pratique. Le PSO-PID garde la tension plus près de la consigne : écart maximal de 0,60 V, contre 0,94 V pour le PINN-PID et 0,97 V pour l'ELM-PID.</w:t>
       </w:r>
     </w:p>
     <w:p>
@@ -5595,7 +5600,7 @@
     </w:p>
     <w:p>
       <w:r>
-        <w:t xml:space="preserve">Sur S8a (figure 5.14), le PINN-PID devance l'ELM-PID de 0,4 %. L'ordre est le même dans les cinq versions du circuit (écart de 0,13 à 1,24 %), mais un tel écart n'a pas de poids pratique. Le PSO-PID garde la tension plus près de la consigne : écart maximal de 0,60 V, contre 0,94 V pour le PINN-PID et 0,97 V pour l'ELM-PID.</w:t>
+        <w:t xml:space="preserve">S10 écarte nettement les quatre méthodes avancées, toutes séparées (figure 5.15) : PSO-PID 3,98 mV·s, PINN-PID 6,63, ELM-PID 8,63 et Fuzzy-PID 9,18. Le PINN-PID dépasse le PSO-PID de 66,5 à 69,9 % selon la version du circuit, l'ELM-PID dépasse le PINN-PID de 16,7 à 30,3 %, et le Fuzzy-PID dépasse l'ELM-PID de 6,3 à 16,7 %.</w:t>
       </w:r>
     </w:p>
     <w:p>
@@ -5615,11 +5620,6 @@
       </w:pPr>
       <w:r>
         <w:t xml:space="preserve">Figure 5.15 : Tension de sortie dans le scénario S10 : ELM-PID, PSO-PID, Fuzzy-PID et PINN-PID. (a) Essai complet ; (b) à (e) agrandissements autour de 50, 100, 115 et 130 ms. Les événements à 145, 160 et 175 ms ne figurent que dans le panneau (a).</w:t>
-      </w:r>
-    </w:p>
-    <w:p>
-      <w:r>
-        <w:t xml:space="preserve">S10 écarte nettement les quatre méthodes avancées, toutes séparées (figure 5.15) : PSO-PID 3,98 mV·s, PINN-PID 6,63, ELM-PID 8,63 et Fuzzy-PID 9,18. Le PINN-PID dépasse le PSO-PID de 66,5 à 69,9 % selon la version du circuit, l'ELM-PID dépasse le PINN-PID de 16,7 à 30,3 %, et le Fuzzy-PID dépasse l'ELM-PID de 6,3 à 16,7 %.</w:t>
       </w:r>
     </w:p>
     <w:p>
@@ -6185,7 +6185,7 @@
         <w:spacing w:before="240"/>
       </w:pPr>
       <w:r>
-        <w:t xml:space="preserve">Figés à 50 ms, le PINN-PID ferait moins bien que l'ELM-PID (17,19 contre 14,60 mV·s) ; c'est son adaptation qui le fait passer devant. Les deux méthodes montent le gain proportionnel, mais elles traitent l'action intégrale en sens opposés (figure 5.9) : l'ELM-PID la porte à 2,07 fois celle de Ziegler-Nichols en fin d'essai, tandis que le PINN-PID la réduit à 0,30 fois sur le banc, et jusqu'à 0,25 fois sous Simulink, borne basse de son ensemble de gains admissibles. Le PINN-PID obtient la plus petite IAE des deux. Nous constatons cette différence sans pouvoir l'expliquer : aucun essai de ce travail n'isole l'effet de l'action intégrale de celui des autres gains.</w:t>
+        <w:t xml:space="preserve">Figés à 50 ms, le PINN-PID ferait moins bien que l'ELM-PID (17,19 contre 14,60 mV·s) ; c'est son adaptation qui le fait passer devant. Les deux méthodes montent le gain proportionnel, mais elles traitent l'action intégrale en sens opposés (figure 5.8) : l'ELM-PID la porte à 2,07 fois celle de Ziegler-Nichols en fin d'essai, tandis que le PINN-PID la réduit à 0,30 fois sur le banc, et jusqu'à 0,25 fois sous Simulink, borne basse de son ensemble de gains admissibles. Le PINN-PID obtient la plus petite IAE des deux. Nous constatons cette différence sans pouvoir l'expliquer : aucun essai de ce travail n'isole l'effet de l'action intégrale de celui des autres gains.</w:t>
       </w:r>
     </w:p>
     <w:p>
@@ -6882,12 +6882,12 @@
         <w:tblLayout w:type="fixed"/>
       </w:tblPr>
       <w:tblGrid>
-        <w:gridCol w:w="1520"/>
-        <w:gridCol w:w="1181"/>
-        <w:gridCol w:w="1314"/>
-        <w:gridCol w:w="1374"/>
-        <w:gridCol w:w="1766"/>
-        <w:gridCol w:w="1632"/>
+        <w:gridCol w:w="1922"/>
+        <w:gridCol w:w="1183"/>
+        <w:gridCol w:w="1251"/>
+        <w:gridCol w:w="1283"/>
+        <w:gridCol w:w="1609"/>
+        <w:gridCol w:w="1539"/>
       </w:tblGrid>
       <w:tr>
         <w:trPr>
@@ -6896,7 +6896,7 @@
         </w:trPr>
         <w:tc>
           <w:tcPr>
-            <w:tcW w:type="dxa" w:w="1520"/>
+            <w:tcW w:type="dxa" w:w="1922"/>
             <w:tcMar>
               <w:top w:type="dxa" w:w="40"/>
               <w:left w:type="dxa" w:w="80"/>
@@ -6921,7 +6921,7 @@
         </w:tc>
         <w:tc>
           <w:tcPr>
-            <w:tcW w:type="dxa" w:w="1181"/>
+            <w:tcW w:type="dxa" w:w="1183"/>
             <w:tcMar>
               <w:top w:type="dxa" w:w="40"/>
               <w:left w:type="dxa" w:w="80"/>
@@ -6946,7 +6946,7 @@
         </w:tc>
         <w:tc>
           <w:tcPr>
-            <w:tcW w:type="dxa" w:w="1314"/>
+            <w:tcW w:type="dxa" w:w="1251"/>
             <w:tcMar>
               <w:top w:type="dxa" w:w="40"/>
               <w:left w:type="dxa" w:w="80"/>
@@ -6971,7 +6971,7 @@
         </w:tc>
         <w:tc>
           <w:tcPr>
-            <w:tcW w:type="dxa" w:w="1374"/>
+            <w:tcW w:type="dxa" w:w="1283"/>
             <w:tcMar>
               <w:top w:type="dxa" w:w="40"/>
               <w:left w:type="dxa" w:w="80"/>
@@ -6996,7 +6996,7 @@
         </w:tc>
         <w:tc>
           <w:tcPr>
-            <w:tcW w:type="dxa" w:w="1766"/>
+            <w:tcW w:type="dxa" w:w="1609"/>
             <w:tcMar>
               <w:top w:type="dxa" w:w="40"/>
               <w:left w:type="dxa" w:w="80"/>
@@ -7021,7 +7021,7 @@
         </w:tc>
         <w:tc>
           <w:tcPr>
-            <w:tcW w:type="dxa" w:w="1632"/>
+            <w:tcW w:type="dxa" w:w="1539"/>
             <w:tcMar>
               <w:top w:type="dxa" w:w="40"/>
               <w:left w:type="dxa" w:w="80"/>
@@ -7052,7 +7052,7 @@
         </w:trPr>
         <w:tc>
           <w:tcPr>
-            <w:tcW w:type="dxa" w:w="1520"/>
+            <w:tcW w:type="dxa" w:w="1922"/>
             <w:tcMar>
               <w:top w:type="dxa" w:w="40"/>
               <w:left w:type="dxa" w:w="80"/>
@@ -7073,7 +7073,7 @@
         </w:tc>
         <w:tc>
           <w:tcPr>
-            <w:tcW w:type="dxa" w:w="1181"/>
+            <w:tcW w:type="dxa" w:w="1183"/>
             <w:tcMar>
               <w:top w:type="dxa" w:w="40"/>
               <w:left w:type="dxa" w:w="80"/>
@@ -7094,7 +7094,7 @@
         </w:tc>
         <w:tc>
           <w:tcPr>
-            <w:tcW w:type="dxa" w:w="1314"/>
+            <w:tcW w:type="dxa" w:w="1251"/>
             <w:tcMar>
               <w:top w:type="dxa" w:w="40"/>
               <w:left w:type="dxa" w:w="80"/>
@@ -7115,7 +7115,7 @@
         </w:tc>
         <w:tc>
           <w:tcPr>
-            <w:tcW w:type="dxa" w:w="1374"/>
+            <w:tcW w:type="dxa" w:w="1283"/>
             <w:tcMar>
               <w:top w:type="dxa" w:w="40"/>
               <w:left w:type="dxa" w:w="80"/>
@@ -7136,7 +7136,7 @@
         </w:tc>
         <w:tc>
           <w:tcPr>
-            <w:tcW w:type="dxa" w:w="1766"/>
+            <w:tcW w:type="dxa" w:w="1609"/>
             <w:tcMar>
               <w:top w:type="dxa" w:w="40"/>
               <w:left w:type="dxa" w:w="80"/>
@@ -7157,7 +7157,7 @@
         </w:tc>
         <w:tc>
           <w:tcPr>
-            <w:tcW w:type="dxa" w:w="1632"/>
+            <w:tcW w:type="dxa" w:w="1539"/>
             <w:tcMar>
               <w:top w:type="dxa" w:w="40"/>
               <w:left w:type="dxa" w:w="80"/>
@@ -7184,7 +7184,7 @@
         </w:trPr>
         <w:tc>
           <w:tcPr>
-            <w:tcW w:type="dxa" w:w="1520"/>
+            <w:tcW w:type="dxa" w:w="1922"/>
             <w:tcMar>
               <w:top w:type="dxa" w:w="40"/>
               <w:left w:type="dxa" w:w="80"/>
@@ -7205,7 +7205,7 @@
         </w:tc>
         <w:tc>
           <w:tcPr>
-            <w:tcW w:type="dxa" w:w="1181"/>
+            <w:tcW w:type="dxa" w:w="1183"/>
             <w:tcMar>
               <w:top w:type="dxa" w:w="40"/>
               <w:left w:type="dxa" w:w="80"/>
@@ -7226,7 +7226,7 @@
         </w:tc>
         <w:tc>
           <w:tcPr>
-            <w:tcW w:type="dxa" w:w="1314"/>
+            <w:tcW w:type="dxa" w:w="1251"/>
             <w:tcMar>
               <w:top w:type="dxa" w:w="40"/>
               <w:left w:type="dxa" w:w="80"/>
@@ -7247,7 +7247,7 @@
         </w:tc>
         <w:tc>
           <w:tcPr>
-            <w:tcW w:type="dxa" w:w="1374"/>
+            <w:tcW w:type="dxa" w:w="1283"/>
             <w:tcMar>
               <w:top w:type="dxa" w:w="40"/>
               <w:left w:type="dxa" w:w="80"/>
@@ -7268,7 +7268,7 @@
         </w:tc>
         <w:tc>
           <w:tcPr>
-            <w:tcW w:type="dxa" w:w="1766"/>
+            <w:tcW w:type="dxa" w:w="1609"/>
             <w:tcMar>
               <w:top w:type="dxa" w:w="40"/>
               <w:left w:type="dxa" w:w="80"/>
@@ -7289,7 +7289,7 @@
         </w:tc>
         <w:tc>
           <w:tcPr>
-            <w:tcW w:type="dxa" w:w="1632"/>
+            <w:tcW w:type="dxa" w:w="1539"/>
             <w:tcMar>
               <w:top w:type="dxa" w:w="40"/>
               <w:left w:type="dxa" w:w="80"/>
@@ -7316,7 +7316,7 @@
         </w:trPr>
         <w:tc>
           <w:tcPr>
-            <w:tcW w:type="dxa" w:w="1520"/>
+            <w:tcW w:type="dxa" w:w="1922"/>
             <w:tcMar>
               <w:top w:type="dxa" w:w="40"/>
               <w:left w:type="dxa" w:w="80"/>
@@ -7337,7 +7337,7 @@
         </w:tc>
         <w:tc>
           <w:tcPr>
-            <w:tcW w:type="dxa" w:w="1181"/>
+            <w:tcW w:type="dxa" w:w="1183"/>
             <w:tcMar>
               <w:top w:type="dxa" w:w="40"/>
               <w:left w:type="dxa" w:w="80"/>
@@ -7358,7 +7358,7 @@
         </w:tc>
         <w:tc>
           <w:tcPr>
-            <w:tcW w:type="dxa" w:w="1314"/>
+            <w:tcW w:type="dxa" w:w="1251"/>
             <w:tcMar>
               <w:top w:type="dxa" w:w="40"/>
               <w:left w:type="dxa" w:w="80"/>
@@ -7379,7 +7379,7 @@
         </w:tc>
         <w:tc>
           <w:tcPr>
-            <w:tcW w:type="dxa" w:w="1374"/>
+            <w:tcW w:type="dxa" w:w="1283"/>
             <w:tcMar>
               <w:top w:type="dxa" w:w="40"/>
               <w:left w:type="dxa" w:w="80"/>
@@ -7400,7 +7400,7 @@
         </w:tc>
         <w:tc>
           <w:tcPr>
-            <w:tcW w:type="dxa" w:w="1766"/>
+            <w:tcW w:type="dxa" w:w="1609"/>
             <w:tcMar>
               <w:top w:type="dxa" w:w="40"/>
               <w:left w:type="dxa" w:w="80"/>
@@ -7421,7 +7421,7 @@
         </w:tc>
         <w:tc>
           <w:tcPr>
-            <w:tcW w:type="dxa" w:w="1632"/>
+            <w:tcW w:type="dxa" w:w="1539"/>
             <w:tcMar>
               <w:top w:type="dxa" w:w="40"/>
               <w:left w:type="dxa" w:w="80"/>
@@ -7448,7 +7448,7 @@
         </w:trPr>
         <w:tc>
           <w:tcPr>
-            <w:tcW w:type="dxa" w:w="1520"/>
+            <w:tcW w:type="dxa" w:w="1922"/>
             <w:tcMar>
               <w:top w:type="dxa" w:w="40"/>
               <w:left w:type="dxa" w:w="80"/>
@@ -7469,7 +7469,7 @@
         </w:tc>
         <w:tc>
           <w:tcPr>
-            <w:tcW w:type="dxa" w:w="1181"/>
+            <w:tcW w:type="dxa" w:w="1183"/>
             <w:tcMar>
               <w:top w:type="dxa" w:w="40"/>
               <w:left w:type="dxa" w:w="80"/>
@@ -7490,7 +7490,7 @@
         </w:tc>
         <w:tc>
           <w:tcPr>
-            <w:tcW w:type="dxa" w:w="1314"/>
+            <w:tcW w:type="dxa" w:w="1251"/>
             <w:tcMar>
               <w:top w:type="dxa" w:w="40"/>
               <w:left w:type="dxa" w:w="80"/>
@@ -7511,7 +7511,7 @@
         </w:tc>
         <w:tc>
           <w:tcPr>
-            <w:tcW w:type="dxa" w:w="1374"/>
+            <w:tcW w:type="dxa" w:w="1283"/>
             <w:tcMar>
               <w:top w:type="dxa" w:w="40"/>
               <w:left w:type="dxa" w:w="80"/>
@@ -7532,7 +7532,7 @@
         </w:tc>
         <w:tc>
           <w:tcPr>
-            <w:tcW w:type="dxa" w:w="1766"/>
+            <w:tcW w:type="dxa" w:w="1609"/>
             <w:tcMar>
               <w:top w:type="dxa" w:w="40"/>
               <w:left w:type="dxa" w:w="80"/>
@@ -7553,7 +7553,7 @@
         </w:tc>
         <w:tc>
           <w:tcPr>
-            <w:tcW w:type="dxa" w:w="1632"/>
+            <w:tcW w:type="dxa" w:w="1539"/>
             <w:tcMar>
               <w:top w:type="dxa" w:w="40"/>
               <w:left w:type="dxa" w:w="80"/>
@@ -7580,7 +7580,7 @@
         </w:trPr>
         <w:tc>
           <w:tcPr>
-            <w:tcW w:type="dxa" w:w="1520"/>
+            <w:tcW w:type="dxa" w:w="1922"/>
             <w:tcMar>
               <w:top w:type="dxa" w:w="40"/>
               <w:left w:type="dxa" w:w="80"/>
@@ -7601,7 +7601,7 @@
         </w:tc>
         <w:tc>
           <w:tcPr>
-            <w:tcW w:type="dxa" w:w="1181"/>
+            <w:tcW w:type="dxa" w:w="1183"/>
             <w:tcMar>
               <w:top w:type="dxa" w:w="40"/>
               <w:left w:type="dxa" w:w="80"/>
@@ -7622,7 +7622,7 @@
         </w:tc>
         <w:tc>
           <w:tcPr>
-            <w:tcW w:type="dxa" w:w="1314"/>
+            <w:tcW w:type="dxa" w:w="1251"/>
             <w:tcMar>
               <w:top w:type="dxa" w:w="40"/>
               <w:left w:type="dxa" w:w="80"/>
@@ -7643,7 +7643,7 @@
         </w:tc>
         <w:tc>
           <w:tcPr>
-            <w:tcW w:type="dxa" w:w="1374"/>
+            <w:tcW w:type="dxa" w:w="1283"/>
             <w:tcMar>
               <w:top w:type="dxa" w:w="40"/>
               <w:left w:type="dxa" w:w="80"/>
@@ -7664,7 +7664,7 @@
         </w:tc>
         <w:tc>
           <w:tcPr>
-            <w:tcW w:type="dxa" w:w="1766"/>
+            <w:tcW w:type="dxa" w:w="1609"/>
             <w:tcMar>
               <w:top w:type="dxa" w:w="40"/>
               <w:left w:type="dxa" w:w="80"/>
@@ -7685,7 +7685,7 @@
         </w:tc>
         <w:tc>
           <w:tcPr>
-            <w:tcW w:type="dxa" w:w="1632"/>
+            <w:tcW w:type="dxa" w:w="1539"/>
             <w:tcMar>
               <w:top w:type="dxa" w:w="40"/>
               <w:left w:type="dxa" w:w="80"/>
@@ -7712,7 +7712,7 @@
         </w:trPr>
         <w:tc>
           <w:tcPr>
-            <w:tcW w:type="dxa" w:w="1520"/>
+            <w:tcW w:type="dxa" w:w="1922"/>
             <w:tcMar>
               <w:top w:type="dxa" w:w="40"/>
               <w:left w:type="dxa" w:w="80"/>
@@ -7733,7 +7733,7 @@
         </w:tc>
         <w:tc>
           <w:tcPr>
-            <w:tcW w:type="dxa" w:w="1181"/>
+            <w:tcW w:type="dxa" w:w="1183"/>
             <w:tcMar>
               <w:top w:type="dxa" w:w="40"/>
               <w:left w:type="dxa" w:w="80"/>
@@ -7754,7 +7754,7 @@
         </w:tc>
         <w:tc>
           <w:tcPr>
-            <w:tcW w:type="dxa" w:w="1314"/>
+            <w:tcW w:type="dxa" w:w="1251"/>
             <w:tcMar>
               <w:top w:type="dxa" w:w="40"/>
               <w:left w:type="dxa" w:w="80"/>
@@ -7775,7 +7775,7 @@
         </w:tc>
         <w:tc>
           <w:tcPr>
-            <w:tcW w:type="dxa" w:w="1374"/>
+            <w:tcW w:type="dxa" w:w="1283"/>
             <w:tcMar>
               <w:top w:type="dxa" w:w="40"/>
               <w:left w:type="dxa" w:w="80"/>
@@ -7796,7 +7796,7 @@
         </w:tc>
         <w:tc>
           <w:tcPr>
-            <w:tcW w:type="dxa" w:w="1766"/>
+            <w:tcW w:type="dxa" w:w="1609"/>
             <w:tcMar>
               <w:top w:type="dxa" w:w="40"/>
               <w:left w:type="dxa" w:w="80"/>
@@ -7817,7 +7817,7 @@
         </w:tc>
         <w:tc>
           <w:tcPr>
-            <w:tcW w:type="dxa" w:w="1632"/>
+            <w:tcW w:type="dxa" w:w="1539"/>
             <w:tcMar>
               <w:top w:type="dxa" w:w="40"/>
               <w:left w:type="dxa" w:w="80"/>
@@ -7844,7 +7844,7 @@
         </w:trPr>
         <w:tc>
           <w:tcPr>
-            <w:tcW w:type="dxa" w:w="1520"/>
+            <w:tcW w:type="dxa" w:w="1922"/>
             <w:tcMar>
               <w:top w:type="dxa" w:w="40"/>
               <w:left w:type="dxa" w:w="80"/>
@@ -7865,7 +7865,7 @@
         </w:tc>
         <w:tc>
           <w:tcPr>
-            <w:tcW w:type="dxa" w:w="1181"/>
+            <w:tcW w:type="dxa" w:w="1183"/>
             <w:tcMar>
               <w:top w:type="dxa" w:w="40"/>
               <w:left w:type="dxa" w:w="80"/>
@@ -7886,7 +7886,7 @@
         </w:tc>
         <w:tc>
           <w:tcPr>
-            <w:tcW w:type="dxa" w:w="1314"/>
+            <w:tcW w:type="dxa" w:w="1251"/>
             <w:tcMar>
               <w:top w:type="dxa" w:w="40"/>
               <w:left w:type="dxa" w:w="80"/>
@@ -7907,7 +7907,7 @@
         </w:tc>
         <w:tc>
           <w:tcPr>
-            <w:tcW w:type="dxa" w:w="1374"/>
+            <w:tcW w:type="dxa" w:w="1283"/>
             <w:tcMar>
               <w:top w:type="dxa" w:w="40"/>
               <w:left w:type="dxa" w:w="80"/>
@@ -7928,7 +7928,7 @@
         </w:tc>
         <w:tc>
           <w:tcPr>
-            <w:tcW w:type="dxa" w:w="1766"/>
+            <w:tcW w:type="dxa" w:w="1609"/>
             <w:tcMar>
               <w:top w:type="dxa" w:w="40"/>
               <w:left w:type="dxa" w:w="80"/>
@@ -7949,7 +7949,7 @@
         </w:tc>
         <w:tc>
           <w:tcPr>
-            <w:tcW w:type="dxa" w:w="1632"/>
+            <w:tcW w:type="dxa" w:w="1539"/>
             <w:tcMar>
               <w:top w:type="dxa" w:w="40"/>
               <w:left w:type="dxa" w:w="80"/>
@@ -7976,7 +7976,7 @@
         </w:trPr>
         <w:tc>
           <w:tcPr>
-            <w:tcW w:type="dxa" w:w="1520"/>
+            <w:tcW w:type="dxa" w:w="1922"/>
             <w:tcMar>
               <w:top w:type="dxa" w:w="40"/>
               <w:left w:type="dxa" w:w="80"/>
@@ -7997,7 +7997,7 @@
         </w:tc>
         <w:tc>
           <w:tcPr>
-            <w:tcW w:type="dxa" w:w="1181"/>
+            <w:tcW w:type="dxa" w:w="1183"/>
             <w:tcMar>
               <w:top w:type="dxa" w:w="40"/>
               <w:left w:type="dxa" w:w="80"/>
@@ -8018,7 +8018,7 @@
         </w:tc>
         <w:tc>
           <w:tcPr>
-            <w:tcW w:type="dxa" w:w="1314"/>
+            <w:tcW w:type="dxa" w:w="1251"/>
             <w:tcMar>
               <w:top w:type="dxa" w:w="40"/>
               <w:left w:type="dxa" w:w="80"/>
@@ -8039,7 +8039,7 @@
         </w:tc>
         <w:tc>
           <w:tcPr>
-            <w:tcW w:type="dxa" w:w="1374"/>
+            <w:tcW w:type="dxa" w:w="1283"/>
             <w:tcMar>
               <w:top w:type="dxa" w:w="40"/>
               <w:left w:type="dxa" w:w="80"/>
@@ -8060,7 +8060,7 @@
         </w:tc>
         <w:tc>
           <w:tcPr>
-            <w:tcW w:type="dxa" w:w="1766"/>
+            <w:tcW w:type="dxa" w:w="1609"/>
             <w:tcMar>
               <w:top w:type="dxa" w:w="40"/>
               <w:left w:type="dxa" w:w="80"/>
@@ -8081,7 +8081,7 @@
         </w:tc>
         <w:tc>
           <w:tcPr>
-            <w:tcW w:type="dxa" w:w="1632"/>
+            <w:tcW w:type="dxa" w:w="1539"/>
             <w:tcMar>
               <w:top w:type="dxa" w:w="40"/>
               <w:left w:type="dxa" w:w="80"/>
@@ -8108,7 +8108,7 @@
         </w:trPr>
         <w:tc>
           <w:tcPr>
-            <w:tcW w:type="dxa" w:w="1520"/>
+            <w:tcW w:type="dxa" w:w="1922"/>
             <w:tcMar>
               <w:top w:type="dxa" w:w="40"/>
               <w:left w:type="dxa" w:w="80"/>
@@ -8129,7 +8129,7 @@
         </w:tc>
         <w:tc>
           <w:tcPr>
-            <w:tcW w:type="dxa" w:w="1181"/>
+            <w:tcW w:type="dxa" w:w="1183"/>
             <w:tcMar>
               <w:top w:type="dxa" w:w="40"/>
               <w:left w:type="dxa" w:w="80"/>
@@ -8150,7 +8150,7 @@
         </w:tc>
         <w:tc>
           <w:tcPr>
-            <w:tcW w:type="dxa" w:w="1314"/>
+            <w:tcW w:type="dxa" w:w="1251"/>
             <w:tcMar>
               <w:top w:type="dxa" w:w="40"/>
               <w:left w:type="dxa" w:w="80"/>
@@ -8171,7 +8171,7 @@
         </w:tc>
         <w:tc>
           <w:tcPr>
-            <w:tcW w:type="dxa" w:w="1374"/>
+            <w:tcW w:type="dxa" w:w="1283"/>
             <w:tcMar>
               <w:top w:type="dxa" w:w="40"/>
               <w:left w:type="dxa" w:w="80"/>
@@ -8192,7 +8192,7 @@
         </w:tc>
         <w:tc>
           <w:tcPr>
-            <w:tcW w:type="dxa" w:w="1766"/>
+            <w:tcW w:type="dxa" w:w="1609"/>
             <w:tcMar>
               <w:top w:type="dxa" w:w="40"/>
               <w:left w:type="dxa" w:w="80"/>
@@ -8213,7 +8213,7 @@
         </w:tc>
         <w:tc>
           <w:tcPr>
-            <w:tcW w:type="dxa" w:w="1632"/>
+            <w:tcW w:type="dxa" w:w="1539"/>
             <w:tcMar>
               <w:top w:type="dxa" w:w="40"/>
               <w:left w:type="dxa" w:w="80"/>
@@ -8240,7 +8240,7 @@
         </w:trPr>
         <w:tc>
           <w:tcPr>
-            <w:tcW w:type="dxa" w:w="1520"/>
+            <w:tcW w:type="dxa" w:w="1922"/>
             <w:tcMar>
               <w:top w:type="dxa" w:w="40"/>
               <w:left w:type="dxa" w:w="80"/>
@@ -8261,7 +8261,7 @@
         </w:tc>
         <w:tc>
           <w:tcPr>
-            <w:tcW w:type="dxa" w:w="1181"/>
+            <w:tcW w:type="dxa" w:w="1183"/>
             <w:tcMar>
               <w:top w:type="dxa" w:w="40"/>
               <w:left w:type="dxa" w:w="80"/>
@@ -8282,7 +8282,7 @@
         </w:tc>
         <w:tc>
           <w:tcPr>
-            <w:tcW w:type="dxa" w:w="1314"/>
+            <w:tcW w:type="dxa" w:w="1251"/>
             <w:tcMar>
               <w:top w:type="dxa" w:w="40"/>
               <w:left w:type="dxa" w:w="80"/>
@@ -8303,7 +8303,7 @@
         </w:tc>
         <w:tc>
           <w:tcPr>
-            <w:tcW w:type="dxa" w:w="1374"/>
+            <w:tcW w:type="dxa" w:w="1283"/>
             <w:tcMar>
               <w:top w:type="dxa" w:w="40"/>
               <w:left w:type="dxa" w:w="80"/>
@@ -8324,7 +8324,7 @@
         </w:tc>
         <w:tc>
           <w:tcPr>
-            <w:tcW w:type="dxa" w:w="1766"/>
+            <w:tcW w:type="dxa" w:w="1609"/>
             <w:tcMar>
               <w:top w:type="dxa" w:w="40"/>
               <w:left w:type="dxa" w:w="80"/>
@@ -8345,7 +8345,7 @@
         </w:tc>
         <w:tc>
           <w:tcPr>
-            <w:tcW w:type="dxa" w:w="1632"/>
+            <w:tcW w:type="dxa" w:w="1539"/>
             <w:tcMar>
               <w:top w:type="dxa" w:w="40"/>
               <w:left w:type="dxa" w:w="80"/>

</xml_diff>

<commit_message>
Chapitre 5 : version Word finale (figure 5.16 et renvoi de synthese replaces)
Co-Authored-By: Claude Opus 5.5 <noreply@anthropic.com>
Claude-Session: https://claude.ai/code/session_01MvWM2RsXLqs8AZ6tPg6HLB
</commit_message>
<xml_diff>
--- a/REDACTION/chapitre5/Chapitre5_Simulation_et_analyse_des_performances.docx
+++ b/REDACTION/chapitre5/Chapitre5_Simulation_et_analyse_des_performances.docx
@@ -2681,7 +2681,7 @@
     </w:p>
     <w:p>
       <w:r>
-        <w:t xml:space="preserve">L'ELM-PID part des gains de Ziegler-Nichols et les modifie ensuite en ligne. La comparaison entre ces deux régulateurs isole donc ce qu'apporte l'adaptation, sur le même bloc PID et le même convertisseur. Nous la menons scénario par scénario, du démarrage nominal au changement durable du point de fonctionnement, puis nous en faisons la synthèse au tableau 5.4.</w:t>
+        <w:t xml:space="preserve">L'ELM-PID part des gains de Ziegler-Nichols et les modifie ensuite en ligne. La comparaison entre ces deux régulateurs isole donc ce qu'apporte l'adaptation, sur le même bloc PID et le même convertisseur. Nous la menons scénario par scénario, du démarrage nominal au changement durable du point de fonctionnement, puis nous en faisons la synthèse (section 5.3.4).</w:t>
       </w:r>
     </w:p>
     <w:p>
@@ -6194,6 +6194,11 @@
       </w:r>
     </w:p>
     <w:p>
+      <w:r>
+        <w:t xml:space="preserve">Sur la commande (figure 5.16), le dernier passage du rapport cyclique en butée a lieu à 175,45 ms pour l'ELM-PID, à 160,2 ms pour le PSO-PID, à 160,1 ms pour le PINN-PID, et dès 53,5 et 52,3 ms pour Ziegler-Nichols et le Fuzzy-PID.</w:t>
+      </w:r>
+    </w:p>
+    <w:p>
       <w:pPr>
         <w:pStyle w:val="Repere"/>
       </w:pPr>
@@ -6210,11 +6215,6 @@
       </w:pPr>
       <w:r>
         <w:t xml:space="preserve">Figure 5.16 : Rapport cyclique dans le scénario S10 : ELM-PID, PSO-PID, Fuzzy-PID et PINN-PID. (a) Essai complet ; (b) à (e) agrandissements autour de 50, 100, 115 et 130 ms.</w:t>
-      </w:r>
-    </w:p>
-    <w:p>
-      <w:r>
-        <w:t xml:space="preserve">Sur la commande (figure 5.16), le dernier passage du rapport cyclique en butée a lieu à 175,45 ms pour l'ELM-PID, à 160,2 ms pour le PSO-PID, à 160,1 ms pour le PINN-PID, et dès 53,5 et 52,3 ms pour Ziegler-Nichols et le Fuzzy-PID.</w:t>
       </w:r>
     </w:p>
     <w:p>

</xml_diff>

<commit_message>
Chapitre 5 : fichier Word nettoye (parties vides et traces du generateur retirees, metadonnees verifiees)
Co-Authored-By: Claude Opus 5.5 <noreply@anthropic.com>
Claude-Session: https://claude.ai/code/session_01MvWM2RsXLqs8AZ6tPg6HLB
</commit_message>
<xml_diff>
--- a/REDACTION/chapitre5/Chapitre5_Simulation_et_analyse_des_performances.docx
+++ b/REDACTION/chapitre5/Chapitre5_Simulation_et_analyse_des_performances.docx
@@ -9421,10 +9421,6 @@
     </w:sectPr>
   </w:body>
 </w:document>
-</file>
-
-<file path=word/comments.xml><?xml version="1.0" encoding="utf-8"?>
-<w:comments xmlns:cx="http://schemas.microsoft.com/office/drawing/2014/chartex" xmlns:cx1="http://schemas.microsoft.com/office/drawing/2015/9/8/chartex" xmlns:cx2="http://schemas.microsoft.com/office/drawing/2015/10/21/chartex" xmlns:cx3="http://schemas.microsoft.com/office/drawing/2016/5/9/chartex" xmlns:cx4="http://schemas.microsoft.com/office/drawing/2016/5/10/chartex" xmlns:cx5="http://schemas.microsoft.com/office/drawing/2016/5/11/chartex" xmlns:cx6="http://schemas.microsoft.com/office/drawing/2016/5/12/chartex" xmlns:cx7="http://schemas.microsoft.com/office/drawing/2016/5/13/chartex" xmlns:cx8="http://schemas.microsoft.com/office/drawing/2016/5/14/chartex" xmlns:mc="http://schemas.openxmlformats.org/markup-compatibility/2006" xmlns:aink="http://schemas.microsoft.com/office/drawing/2016/ink" xmlns:am3d="http://schemas.microsoft.com/office/drawing/2017/model3d" xmlns:o="urn:schemas-microsoft-com:office:office" xmlns:r="http://schemas.openxmlformats.org/officeDocument/2006/relationships" xmlns:m="http://schemas.openxmlformats.org/officeDocument/2006/math" xmlns:v="urn:schemas-microsoft-com:vml" xmlns:wp14="http://schemas.microsoft.com/office/word/2010/wordprocessingDrawing" xmlns:wp="http://schemas.openxmlformats.org/drawingml/2006/wordprocessingDrawing" xmlns:w10="urn:schemas-microsoft-com:office:word" xmlns:w="http://schemas.openxmlformats.org/wordprocessingml/2006/main" xmlns:w14="http://schemas.microsoft.com/office/word/2010/wordml" xmlns:w15="http://schemas.microsoft.com/office/word/2012/wordml" xmlns:w16cex="http://schemas.microsoft.com/office/word/2018/wordml/cex" xmlns:w16cid="http://schemas.microsoft.com/office/word/2016/wordml/cid" xmlns:w16="http://schemas.microsoft.com/office/word/2018/wordml" xmlns:w16sdtdh="http://schemas.microsoft.com/office/word/2020/wordml/sdtdatahash" xmlns:w16se="http://schemas.microsoft.com/office/word/2015/wordml/symex" xmlns:wpg="http://schemas.microsoft.com/office/word/2010/wordprocessingGroup" xmlns:wpi="http://schemas.microsoft.com/office/word/2010/wordprocessingInk" xmlns:wne="http://schemas.microsoft.com/office/word/2006/wordml" xmlns:wps="http://schemas.microsoft.com/office/word/2010/wordprocessingShape"/>
 </file>
 
 <file path=word/endnotes.xml><?xml version="1.0" encoding="utf-8"?>

</xml_diff>

<commit_message>
Chapitres 5 et 6 : incoherences de notation, de vocabulaire et de chiffres corrigees
Co-Authored-By: Claude Opus 5.5 <noreply@anthropic.com>
Claude-Session: https://claude.ai/code/session_01MvWM2RsXLqs8AZ6tPg6HLB
</commit_message>
<xml_diff>
--- a/REDACTION/chapitre5/Chapitre5_Simulation_et_analyse_des_performances.docx
+++ b/REDACTION/chapitre5/Chapitre5_Simulation_et_analyse_des_performances.docx
@@ -1196,7 +1196,7 @@
         <w:t xml:space="preserve">N</w:t>
       </w:r>
       <w:r>
-        <w:t xml:space="preserve"> = 64 122,9 rad/s est le coefficient du filtre du terme dérivé. L'intégrateur et le filtre sont discrétisés par la méthode d'Euler explicite. La sortie est bornée à [0,01 ; 0,99], et l'intégration s'arrête quand la sortie est en butée et que l'erreur pousse dans le même sens (anti-emballement par blocage de l'intégrateur, ou « clamping ») [Åström et Hägglund, 2006].</w:t>
+        <w:t xml:space="preserve"> = 64 122,9 rad/s est le coefficient du filtre du terme dérivé. L'intégrateur et le filtre sont discrétisés par la méthode d'Euler explicite. La sortie est bornée à [0,01 ; 0,99]. Quand elle est en butée et que l'erreur pousse dans le même sens, l'intégration s'arrête : c'est un anti-emballement par intégration conditionnelle (blocage de l'intégrateur en butée) [Åström et Hägglund, 2006].</w:t>
       </w:r>
     </w:p>
     <w:p>
@@ -1266,7 +1266,7 @@
         <w:t xml:space="preserve">D</w:t>
       </w:r>
       <w:r>
-        <w:t xml:space="preserve"> du bloc (5.1) distingue les cinq méthodes. Le PID de Ziegler-Nichols garde ses gains fixes. Le PSO-PID garde aussi des gains fixes, réglés hors ligne par essaim particulaire [Gaing, 2004] sur des essais de réglage distincts des essais de jugement. Le Fuzzy-PID modifie ses gains en ligne par l'ordonnancement flou de [Zhao et al., 1993]. L'ELM-PID les adapte à partir d'un réseau ELM mis à jour en ligne [Lu et al., 2021 ; Liang et al., 2006] (chapitre 4). Le PINN-PID les adapte en minimisant le coût de [Ito et Wasa, 2025]. Le modèle du convertisseur, les bornes, l'anti-emballement et les conditions de simulation sont identiques pour tous.</w:t>
+        <w:t xml:space="preserve"> du bloc (5.1) distingue les cinq méthodes. Le PID de Ziegler-Nichols garde ses gains fixes. Le PSO-PID garde aussi des gains fixes, réglés hors ligne par essaim particulaire [Gaing, 2004] sur des essais de réglage distincts des essais de jugement. Le Fuzzy-PID modifie ses gains en ligne par l'ordonnancement flou de [Zhao et al., 1993]. L'ELM-PID les adapte à partir d'un réseau ELM mis à jour en ligne [Lu et al., 2021 ; Liang et al., 2006] (chapitre 4). Le PINN-PID les adapte en minimisant le coût de [Ito et Wasa, 2025]. Le modèle du convertisseur, les bornes, l'intégration conditionnelle et les conditions de simulation sont identiques pour tous.</w:t>
       </w:r>
     </w:p>
     <w:p>
@@ -2381,17 +2381,7 @@
     </w:p>
     <w:p>
       <w:r>
-        <w:t xml:space="preserve">D'autres grandeurs sont publiées à côté, sans changer le classement. Le dépassement </w:t>
-      </w:r>
-      <w:r>
-        <w:rPr>
-          <w:i/>
-          <w:iCs/>
-        </w:rPr>
-        <w:t xml:space="preserve">D</w:t>
-      </w:r>
-      <w:r>
-        <w:t xml:space="preserve"> est l'écart maximal de la tension au-dessus de 100 V pendant le démarrage, en pourcentage de la consigne. Le temps d'établissement est le dernier instant du démarrage où |</w:t>
+        <w:t xml:space="preserve">D'autres grandeurs sont publiées à côté, sans changer le classement. Le dépassement est l'écart maximal de la tension au-dessus de 100 V pendant le démarrage, en pourcentage de la consigne. Le temps d'établissement est le dernier instant du démarrage où |</w:t>
       </w:r>
       <w:r>
         <w:rPr>
@@ -2659,7 +2649,7 @@
     </w:p>
     <w:p>
       <w:r>
-        <w:t xml:space="preserve">Pendant la mise au point des méthodes, nous avons suivi un indice global J, moyenne de treize rapports d'IAE à Ziegler-Nichols calculés sur les onze essais. Il ne sert pas à juger dans ce chapitre : une moyenne arithmétique de rapports dépend de la référence choisie au dénominateur et donne le même poids à tous les essais </w:t>
+        <w:t xml:space="preserve">Pendant la mise au point des méthodes, nous avons suivi un indice global, moyenne de treize rapports d'IAE à Ziegler-Nichols calculés sur les onze essais. Il ne sert pas à juger dans ce chapitre : une moyenne arithmétique de rapports dépend de la référence choisie au dénominateur et donne le même poids à tous les essais </w:t>
       </w:r>
       <w:r>
         <w:rPr>
@@ -2718,7 +2708,7 @@
     </w:p>
     <w:p>
       <w:r>
-        <w:t xml:space="preserve">L'explication tient au rapport cyclique (figure 5.3). Pendant la montée en tension, il est en butée pendant 1,791 ms au total, la dernière fois à 2,077 ms, pour les deux régulateurs. Or la boucle d'adaptation, reprise de [Lu et al., 2021], travaille par fenêtres de 0,5 ms et reste bloquée tant que la commande est saturée dans la fenêtre courante ou dans l'une des deux précédentes : en saturation, le rapport cyclique ne dépend plus des gains, et le gradient calculé n'aurait pas de sens. Les gains ne changent donc qu'après la fin de la saturation. Sur S1, ils changent une seule fois, à 4 ms, et passent à 1,47 fois le gain proportionnel, 1,06 fois le gain intégral et 1,15 fois le gain dérivé de Ziegler-Nichols. Ils ne bougent plus ensuite. La montée elle-même s'est faite avec les gains de Ziegler-Nichols, d'où la même réponse.</w:t>
+        <w:t xml:space="preserve">L'explication tient au rapport cyclique (figure 5.3). Pendant la montée en tension, il est en butée pendant 1,791 ms au total, la dernière fois à 2,077 ms, pour les deux régulateurs. Or la boucle d'adaptation, reprise de [Lu et al., 2021], travaille par fenêtres de 0,5 ms et passe par une porte, qui suspend l'adaptation tant que la commande est en butée dans la fenêtre courante ou dans l'une des deux précédentes (chapitre 4) : en saturation, le rapport cyclique ne dépend plus des gains, et le gradient calculé n'aurait pas de sens. Les gains ne changent donc qu'après la fin de la saturation. Sur S1, ils changent une seule fois, à 4 ms, et passent à 1,47 fois le gain proportionnel, 1,06 fois le gain intégral et 1,15 fois le gain dérivé de Ziegler-Nichols. Ils ne bougent plus ensuite. La montée elle-même s'est faite avec les gains de Ziegler-Nichols, d'où la même réponse.</w:t>
       </w:r>
     </w:p>
     <w:p>
@@ -5680,9 +5670,9 @@
         <w:tblLayout w:type="fixed"/>
       </w:tblPr>
       <w:tblGrid>
-        <w:gridCol w:w="3509"/>
-        <w:gridCol w:w="2636"/>
-        <w:gridCol w:w="2642"/>
+        <w:gridCol w:w="3518"/>
+        <w:gridCol w:w="2631"/>
+        <w:gridCol w:w="2638"/>
       </w:tblGrid>
       <w:tr>
         <w:trPr>
@@ -5691,7 +5681,7 @@
         </w:trPr>
         <w:tc>
           <w:tcPr>
-            <w:tcW w:type="dxa" w:w="3509"/>
+            <w:tcW w:type="dxa" w:w="3518"/>
             <w:tcMar>
               <w:top w:type="dxa" w:w="40"/>
               <w:left w:type="dxa" w:w="80"/>
@@ -5716,7 +5706,7 @@
         </w:tc>
         <w:tc>
           <w:tcPr>
-            <w:tcW w:type="dxa" w:w="2636"/>
+            <w:tcW w:type="dxa" w:w="2631"/>
             <w:tcMar>
               <w:top w:type="dxa" w:w="40"/>
               <w:left w:type="dxa" w:w="80"/>
@@ -5741,7 +5731,7 @@
         </w:tc>
         <w:tc>
           <w:tcPr>
-            <w:tcW w:type="dxa" w:w="2642"/>
+            <w:tcW w:type="dxa" w:w="2638"/>
             <w:tcMar>
               <w:top w:type="dxa" w:w="40"/>
               <w:left w:type="dxa" w:w="80"/>
@@ -5772,7 +5762,7 @@
         </w:trPr>
         <w:tc>
           <w:tcPr>
-            <w:tcW w:type="dxa" w:w="3509"/>
+            <w:tcW w:type="dxa" w:w="3518"/>
             <w:tcMar>
               <w:top w:type="dxa" w:w="40"/>
               <w:left w:type="dxa" w:w="80"/>
@@ -5793,7 +5783,7 @@
         </w:tc>
         <w:tc>
           <w:tcPr>
-            <w:tcW w:type="dxa" w:w="2636"/>
+            <w:tcW w:type="dxa" w:w="2631"/>
             <w:tcMar>
               <w:top w:type="dxa" w:w="40"/>
               <w:left w:type="dxa" w:w="80"/>
@@ -5814,7 +5804,7 @@
         </w:tc>
         <w:tc>
           <w:tcPr>
-            <w:tcW w:type="dxa" w:w="2642"/>
+            <w:tcW w:type="dxa" w:w="2638"/>
             <w:tcMar>
               <w:top w:type="dxa" w:w="40"/>
               <w:left w:type="dxa" w:w="80"/>
@@ -5841,7 +5831,7 @@
         </w:trPr>
         <w:tc>
           <w:tcPr>
-            <w:tcW w:type="dxa" w:w="3509"/>
+            <w:tcW w:type="dxa" w:w="3518"/>
             <w:tcMar>
               <w:top w:type="dxa" w:w="40"/>
               <w:left w:type="dxa" w:w="80"/>
@@ -5862,7 +5852,7 @@
         </w:tc>
         <w:tc>
           <w:tcPr>
-            <w:tcW w:type="dxa" w:w="2636"/>
+            <w:tcW w:type="dxa" w:w="2631"/>
             <w:tcMar>
               <w:top w:type="dxa" w:w="40"/>
               <w:left w:type="dxa" w:w="80"/>
@@ -5883,7 +5873,7 @@
         </w:tc>
         <w:tc>
           <w:tcPr>
-            <w:tcW w:type="dxa" w:w="2642"/>
+            <w:tcW w:type="dxa" w:w="2638"/>
             <w:tcMar>
               <w:top w:type="dxa" w:w="40"/>
               <w:left w:type="dxa" w:w="80"/>
@@ -5910,7 +5900,7 @@
         </w:trPr>
         <w:tc>
           <w:tcPr>
-            <w:tcW w:type="dxa" w:w="3509"/>
+            <w:tcW w:type="dxa" w:w="3518"/>
             <w:tcMar>
               <w:top w:type="dxa" w:w="40"/>
               <w:left w:type="dxa" w:w="80"/>
@@ -5931,43 +5921,43 @@
         </w:tc>
         <w:tc>
           <w:tcPr>
-            <w:tcW w:type="dxa" w:w="2636"/>
-            <w:tcMar>
-              <w:top w:type="dxa" w:w="40"/>
-              <w:left w:type="dxa" w:w="80"/>
-              <w:bottom w:type="dxa" w:w="40"/>
-              <w:right w:type="dxa" w:w="80"/>
-            </w:tcMar>
-            <w:vAlign w:val="center"/>
-          </w:tcPr>
-          <w:p>
-            <w:pPr>
-              <w:pStyle w:val="TexteTableau"/>
-              <w:jc w:val="center"/>
-            </w:pPr>
-            <w:r>
-              <w:t xml:space="preserve">40,9 %</w:t>
-            </w:r>
-          </w:p>
-        </w:tc>
-        <w:tc>
-          <w:tcPr>
-            <w:tcW w:type="dxa" w:w="2642"/>
-            <w:tcMar>
-              <w:top w:type="dxa" w:w="40"/>
-              <w:left w:type="dxa" w:w="80"/>
-              <w:bottom w:type="dxa" w:w="40"/>
-              <w:right w:type="dxa" w:w="80"/>
-            </w:tcMar>
-            <w:vAlign w:val="center"/>
-          </w:tcPr>
-          <w:p>
-            <w:pPr>
-              <w:pStyle w:val="TexteTableau"/>
-              <w:jc w:val="center"/>
-            </w:pPr>
-            <w:r>
-              <w:t xml:space="preserve">61,5 %</w:t>
+            <w:tcW w:type="dxa" w:w="2631"/>
+            <w:tcMar>
+              <w:top w:type="dxa" w:w="40"/>
+              <w:left w:type="dxa" w:w="80"/>
+              <w:bottom w:type="dxa" w:w="40"/>
+              <w:right w:type="dxa" w:w="80"/>
+            </w:tcMar>
+            <w:vAlign w:val="center"/>
+          </w:tcPr>
+          <w:p>
+            <w:pPr>
+              <w:pStyle w:val="TexteTableau"/>
+              <w:jc w:val="center"/>
+            </w:pPr>
+            <w:r>
+              <w:t xml:space="preserve">41 %</w:t>
+            </w:r>
+          </w:p>
+        </w:tc>
+        <w:tc>
+          <w:tcPr>
+            <w:tcW w:type="dxa" w:w="2638"/>
+            <w:tcMar>
+              <w:top w:type="dxa" w:w="40"/>
+              <w:left w:type="dxa" w:w="80"/>
+              <w:bottom w:type="dxa" w:w="40"/>
+              <w:right w:type="dxa" w:w="80"/>
+            </w:tcMar>
+            <w:vAlign w:val="center"/>
+          </w:tcPr>
+          <w:p>
+            <w:pPr>
+              <w:pStyle w:val="TexteTableau"/>
+              <w:jc w:val="center"/>
+            </w:pPr>
+            <w:r>
+              <w:t xml:space="preserve">61 %</w:t>
             </w:r>
           </w:p>
         </w:tc>
@@ -5979,7 +5969,7 @@
         </w:trPr>
         <w:tc>
           <w:tcPr>
-            <w:tcW w:type="dxa" w:w="3509"/>
+            <w:tcW w:type="dxa" w:w="3518"/>
             <w:tcMar>
               <w:top w:type="dxa" w:w="40"/>
               <w:left w:type="dxa" w:w="80"/>
@@ -6000,7 +5990,7 @@
         </w:tc>
         <w:tc>
           <w:tcPr>
-            <w:tcW w:type="dxa" w:w="2636"/>
+            <w:tcW w:type="dxa" w:w="2631"/>
             <w:tcMar>
               <w:top w:type="dxa" w:w="40"/>
               <w:left w:type="dxa" w:w="80"/>
@@ -6021,7 +6011,7 @@
         </w:tc>
         <w:tc>
           <w:tcPr>
-            <w:tcW w:type="dxa" w:w="2642"/>
+            <w:tcW w:type="dxa" w:w="2638"/>
             <w:tcMar>
               <w:top w:type="dxa" w:w="40"/>
               <w:left w:type="dxa" w:w="80"/>
@@ -6048,7 +6038,7 @@
         </w:trPr>
         <w:tc>
           <w:tcPr>
-            <w:tcW w:type="dxa" w:w="3509"/>
+            <w:tcW w:type="dxa" w:w="3518"/>
             <w:tcMar>
               <w:top w:type="dxa" w:w="40"/>
               <w:left w:type="dxa" w:w="80"/>
@@ -6069,7 +6059,7 @@
         </w:tc>
         <w:tc>
           <w:tcPr>
-            <w:tcW w:type="dxa" w:w="2636"/>
+            <w:tcW w:type="dxa" w:w="2631"/>
             <w:tcMar>
               <w:top w:type="dxa" w:w="40"/>
               <w:left w:type="dxa" w:w="80"/>
@@ -6090,7 +6080,7 @@
         </w:tc>
         <w:tc>
           <w:tcPr>
-            <w:tcW w:type="dxa" w:w="2642"/>
+            <w:tcW w:type="dxa" w:w="2638"/>
             <w:tcMar>
               <w:top w:type="dxa" w:w="40"/>
               <w:left w:type="dxa" w:w="80"/>
@@ -6117,7 +6107,7 @@
         </w:trPr>
         <w:tc>
           <w:tcPr>
-            <w:tcW w:type="dxa" w:w="3509"/>
+            <w:tcW w:type="dxa" w:w="3518"/>
             <w:tcMar>
               <w:top w:type="dxa" w:w="40"/>
               <w:left w:type="dxa" w:w="80"/>
@@ -6138,7 +6128,7 @@
         </w:tc>
         <w:tc>
           <w:tcPr>
-            <w:tcW w:type="dxa" w:w="2636"/>
+            <w:tcW w:type="dxa" w:w="2631"/>
             <w:tcMar>
               <w:top w:type="dxa" w:w="40"/>
               <w:left w:type="dxa" w:w="80"/>
@@ -6159,7 +6149,7 @@
         </w:tc>
         <w:tc>
           <w:tcPr>
-            <w:tcW w:type="dxa" w:w="2642"/>
+            <w:tcW w:type="dxa" w:w="2638"/>
             <w:tcMar>
               <w:top w:type="dxa" w:w="40"/>
               <w:left w:type="dxa" w:w="80"/>
@@ -6185,7 +6175,7 @@
         <w:spacing w:before="240"/>
       </w:pPr>
       <w:r>
-        <w:t xml:space="preserve">Figés à 50 ms, le PINN-PID ferait moins bien que l'ELM-PID (17,19 contre 14,60 mV·s) ; c'est son adaptation qui le fait passer devant. Les deux méthodes montent le gain proportionnel, mais elles traitent l'action intégrale en sens opposés (figure 5.8) : l'ELM-PID la porte à 2,07 fois celle de Ziegler-Nichols en fin d'essai, tandis que le PINN-PID la réduit à 0,30 fois sur le banc, et jusqu'à 0,25 fois sous Simulink, borne basse de son ensemble de gains admissibles. Le PINN-PID obtient la plus petite IAE des deux. Nous constatons cette différence sans pouvoir l'expliquer : aucun essai de ce travail n'isole l'effet de l'action intégrale de celui des autres gains.</w:t>
+        <w:t xml:space="preserve">Figés à 50 ms, le PINN-PID ferait moins bien que l'ELM-PID (17,19 contre 14,60 mV·s) ; c'est son adaptation qui le fait passer devant. Les deux méthodes montent le gain proportionnel, mais elles traitent l'action intégrale en sens opposés (figure 5.8) : l'ELM-PID la porte à 2,07 fois celle de Ziegler-Nichols en fin d'essai, tandis que le PINN-PID la réduit à 0,30 fois sur le banc, et jusqu'à 0,25 fois sous Simulink, borne basse de sa boîte de gains. Le PINN-PID obtient la plus petite IAE des deux. Nous constatons cette différence sans pouvoir l'expliquer : aucun essai de ce travail n'isole l'effet de l'action intégrale de celui des autres gains.</w:t>
       </w:r>
     </w:p>
     <w:p>
@@ -8371,7 +8361,7 @@
         <w:spacing w:before="240"/>
       </w:pPr>
       <w:r>
-        <w:t xml:space="preserve">Le PSO-PID a le plus petit rapport d'IAE sur les cinq scénarios et le plus petit dépassement. L'ELM-PID et le PINN-PID sont proches l'un de l'autre partout, sauf sur S10. Le Fuzzy-PID et Ziegler-Nichols viennent derrière : le premier est le moins bon au démarrage, le second à charge légère. Sur le temps en butée, en revanche, le PSO-PID et l'ELM-PID sont les moins bons. Le tableau montre aussi ce que coûte chaque approche. Les deux méthodes à gains fixes déplacent tout leur travail hors ligne ; le PSO-PID en fait le plus, et c'est lui qui obtient les meilleurs résultats. Les deux méthodes adaptatives demandent un travail hors ligne plus court, centré sur l'apprentissage d'un réseau, puis un calcul en ligne plus lourd, d'un facteur 2,6 pour l'ELM-PID et 28 pour le PINN-PID par rapport au PSO-PID. Nous ne calculons pas d'indice global : le classement qui en sortirait dépendrait des poids donnés à chaque grandeur, pour la raison donnée à la section 5.2.3.</w:t>
+        <w:t xml:space="preserve">Le PSO-PID a le plus petit rapport d'IAE sur les cinq scénarios et le plus petit dépassement. L'ELM-PID et le PINN-PID sont proches l'un de l'autre partout, sauf sur S10. Le Fuzzy-PID et Ziegler-Nichols viennent derrière : le premier est le moins bon au démarrage, le second à charge légère. Sur le temps en butée, en revanche, le PSO-PID et l'ELM-PID sont les moins bons. Le tableau montre aussi ce que coûte chaque approche. Les deux méthodes à gains fixes déplacent tout leur travail hors ligne ; le PSO-PID en fait le plus, et c'est lui qui obtient les meilleurs résultats. Les deux méthodes adaptatives demandent un travail hors ligne plus court, centré sur l'apprentissage d'un réseau, puis un calcul en ligne plus lourd : 2,5 fois celui du PSO-PID pour l'ELM-PID, 27 fois pour le PINN-PID. Nous ne calculons pas d'indice global : le classement qui en sortirait dépendrait des poids donnés à chaque grandeur, pour la raison donnée à la section 5.2.3.</w:t>
       </w:r>
     </w:p>
     <w:p>
@@ -8384,7 +8374,7 @@
     </w:p>
     <w:p>
       <w:r>
-        <w:t xml:space="preserve">La proposition du travail annonçait des résultats avant tout calcul. Ses phrases ont été réécrites en hypothèses vérifiables le 8 octobre 2026, avant le calcul des résultats de ce chapitre ; le coût J des versions de mise au point des méthodes était alors déjà connu. Le tableau 5.9 confronte ces hypothèses aux résultats. Le « PID à gains fixes » de la première hypothèse est ici le PID de Ziegler-Nichols.</w:t>
+        <w:t xml:space="preserve">La proposition du travail annonçait des résultats avant tout calcul. Ses phrases ont été réécrites en hypothèses vérifiables le 8 octobre 2026, avant le calcul des résultats de ce chapitre ; l'indice global des versions de mise au point des méthodes (section 5.2.3) était alors déjà connu. Le tableau 5.9 confronte ces hypothèses aux résultats. Le « PID à gains fixes » de la première hypothèse est ici le PID de Ziegler-Nichols.</w:t>
       </w:r>
     </w:p>
     <w:p>
@@ -8838,7 +8828,7 @@
     </w:p>
     <w:p>
       <w:r>
-        <w:t xml:space="preserve">Ces résultats s'accordent avec ce que l'on sait du réseau. Sur 4 615 fenêtres de contrôle, la sensibilité vraie du convertisseur varie avec la charge, de 11,2 V par unité de rapport cyclique (médiane, 4 à 6 Ω) à 15,8 V (50 à 99 Ω). Celle du réseau reste autour de 11 V (médianes de 11,06 à 11,44 V selon la classe de charge), et sa corrélation avec la valeur vraie, en logarithme, est de −0,04. Avec les seules tensions et rapports cycliques passés, la charge n'est pas observable à l'échelle d'une fenêtre de 0,5 ms. Le réseau agit donc comme un identificateur qui donne à la boucle le signe et l'ordre de grandeur de ∂</w:t>
+        <w:t xml:space="preserve">Ces résultats s'accordent avec ce que l'on sait du réseau. Sur 4 615 fenêtres de contrôle, la sensibilité vraie du convertisseur varie avec la charge, de 11,2 V par unité de rapport cyclique (médiane, 4 à 6 Ω) à 15,8 V (50 à 99 Ω). Celle du réseau reste autour de 11 V (médianes de 11,06 à 11,44 V selon la classe de charge), et la corrélation entre les logarithmes du jacobien du réseau et du jacobien vrai est de −0,04. Le réseau ne reçoit que des moyennes par fenêtre : celles de la tension de sortie sur les deux fenêtres précédentes, celles du rapport cyclique sur la fenêtre courante et les deux précédentes. Avec ces seules entrées, la charge n'est pas observable à l'échelle d'une fenêtre de 0,5 ms. Le réseau agit donc comme un identificateur qui donne à la boucle le signe et l'ordre de grandeur de ∂</w:t>
       </w:r>
       <w:r>
         <w:rPr>

</xml_diff>

<commit_message>
Chapitre 4 en Word avec ses schemas ; chapitres 5 et 6 alignes sur le chapitre 4
Loi (4.7) au lieu de l'ancienne (5.4), tension mesuree et jacobien d'y,
reouverture de la porte 1,5 a 2 ms apres l'evenement, figure 4.3 retouchee.

Co-Authored-By: Claude Opus 5.5 <noreply@anthropic.com>
Claude-Session: https://claude.ai/code/session_01MvWM2RsXLqs8AZ6tPg6HLB
</commit_message>
<xml_diff>
--- a/REDACTION/chapitre5/Chapitre5_Simulation_et_analyse_des_performances.docx
+++ b/REDACTION/chapitre5/Chapitre5_Simulation_et_analyse_des_performances.docx
@@ -2708,7 +2708,7 @@
     </w:p>
     <w:p>
       <w:r>
-        <w:t xml:space="preserve">L'explication tient au rapport cyclique (figure 5.3). Pendant la montée en tension, il est en butée pendant 1,791 ms au total, la dernière fois à 2,077 ms, pour les deux régulateurs. Or la boucle d'adaptation, reprise de [Lu et al., 2021], travaille par fenêtres de 0,5 ms et passe par une porte, qui suspend l'adaptation tant que la commande est en butée dans la fenêtre courante ou dans l'une des deux précédentes (chapitre 4) : en saturation, le rapport cyclique ne dépend plus des gains, et le gradient calculé n'aurait pas de sens. Les gains ne changent donc qu'après la fin de la saturation. Sur S1, ils changent une seule fois, à 4 ms, et passent à 1,47 fois le gain proportionnel, 1,06 fois le gain intégral et 1,15 fois le gain dérivé de Ziegler-Nichols. Ils ne bougent plus ensuite. La montée elle-même s'est faite avec les gains de Ziegler-Nichols, d'où la même réponse.</w:t>
+        <w:t xml:space="preserve">L'explication tient au rapport cyclique (figure 5.3). Pendant la montée en tension, il est en butée pendant 1,791 ms au total, la dernière fois à 2,077 ms, pour les deux régulateurs. Or la boucle d'adaptation, reprise de [Lu et al., 2021], travaille par fenêtres de 0,5 ms et passe par une porte, qui suspend l'adaptation tant que la commande est en butée dans la fenêtre courante ou dans l'une des deux précédentes (section 4.4.2) : en saturation, le rapport cyclique ne dépend plus des gains, et le gradient calculé n'aurait pas de sens. Les gains ne changent donc qu'après la fin de la saturation. Sur S1, ils changent une seule fois, à 4 ms, et passent à 1,47 fois le gain proportionnel, 1,06 fois le gain intégral et 1,15 fois le gain dérivé de Ziegler-Nichols. Ils ne bougent plus ensuite. La montée elle-même s'est faite avec les gains de Ziegler-Nichols, d'où la même réponse.</w:t>
       </w:r>
     </w:p>
     <w:p>
@@ -2788,7 +2788,7 @@
     </w:p>
     <w:p>
       <w:r>
-        <w:t xml:space="preserve">Les gains ne changent pas pendant les 20 ms de perturbation. À chaque événement, la fenêtre de l'événement et les deux suivantes sont saturées ou suivent une saturation, et la boucle d'adaptation reste bloquée. Quand elle se rouvre, 1,5 ms plus tard, l'erreur moyenne de la fenêtre est déjà sous la zone morte de 0,1 V : la perturbation est rattrapée par le PID avant que la boucle lente puisse agir. Le gain de 15 à 26 % vient donc des gains atteints à 4 ms, à la fin du démarrage. Un PID aux gains fixes de 1,47, 1,06 et 1,15 fois ceux de Ziegler-Nichols, sans aucune adaptation, donne d'ailleurs la même IAE sur S3 (6,41 mV·s). Sur ces deux scénarios, l'ELM-PID a trouvé en ligne un meilleur réglage fixe ; il n'a pas réagi à la perturbation.</w:t>
+        <w:t xml:space="preserve">Les gains ne changent pas pendant les 20 ms de perturbation. À chaque événement, la fenêtre de l'événement et les deux suivantes sont saturées ou suivent une saturation, et la boucle d'adaptation reste bloquée. Quand elle se rouvre, 1,5 ms après la fin de la fenêtre saturée, soit 1,5 à 2 ms après l'événement, l'erreur moyenne de la fenêtre est déjà sous la zone morte de 0,1 V : la perturbation est rattrapée par le PID avant que la boucle lente puisse agir. Le gain de 15 à 26 % vient donc des gains atteints à 4 ms, à la fin du démarrage. Un PID aux gains fixes de 1,47, 1,06 et 1,15 fois ceux de Ziegler-Nichols, sans aucune adaptation, donne d'ailleurs la même IAE sur S3 (6,41 mV·s). Sur ces deux scénarios, l'ELM-PID a trouvé en ligne un meilleur réglage fixe ; il n'a pas réagi à la perturbation.</w:t>
       </w:r>
     </w:p>
     <w:p>
@@ -6180,7 +6180,7 @@
     </w:p>
     <w:p>
       <w:r>
-        <w:t xml:space="preserve">Le PSO-PID, à gains fixes, reste pourtant devant les deux. Ses gains valent 2,55, 1,37 et 2,61 fois ceux de Ziegler-Nichols, sur tout l'essai. Ils ont été réglés hors ligne [Gaing, 2004] sur quatre essais de réglage distincts des essais de jugement : un échelon de charge à 7 Ω, des échelons de tension d'entrée (175 puis 235 V) à 15 Ω, un échelon de consigne à charge légère (60 Ω) et un essai avec bruit de mesure et quantification. Le réglage imposait en outre une marge de phase d'au moins 30° à douze points de fonctionnement, de 4 à 98 Ω et de 160 à 240 V, ce qui inclut le point de S10. Aucun de ces essais ne contient d'échelon de charge à 25 Ω sous 160 V. Les méthodes adaptatives, elles, partent des gains de Ziegler-Nichols et les font monter en ligne ; à 50 ms, leurs gains dérivés n'atteignent pas la moitié de celui du PSO-PID.</w:t>
+        <w:t xml:space="preserve">Le PSO-PID, à gains fixes, reste pourtant devant les deux. Ses gains valent 2,55, 1,37 et 2,61 fois ceux de Ziegler-Nichols, sur tout l'essai. Ils ont été réglés hors ligne [Gaing, 2004] sur quatre essais de réglage distincts des essais de jugement : un échelon de charge de 7 à 4,5 Ω, des échelons de tension d'entrée (175 puis 235 V) à 15 Ω, un échelon de consigne à charge légère (60 Ω) et un essai avec bruit de mesure et quantification. Le réglage imposait en outre une marge de phase d'au moins 30° à douze points de fonctionnement, de 4 à 98 Ω et de 160 à 240 V, ce qui inclut le point de S10. Aucun de ces essais ne contient d'échelon de charge à 25 Ω sous 160 V. Les méthodes adaptatives, elles, partent des gains de Ziegler-Nichols et les font monter en ligne ; à 50 ms, leurs gains dérivés n'atteignent pas la moitié de celui du PSO-PID.</w:t>
       </w:r>
     </w:p>
     <w:p>
@@ -6874,10 +6874,10 @@
       <w:tblGrid>
         <w:gridCol w:w="1922"/>
         <w:gridCol w:w="1183"/>
-        <w:gridCol w:w="1251"/>
-        <w:gridCol w:w="1283"/>
-        <w:gridCol w:w="1609"/>
-        <w:gridCol w:w="1539"/>
+        <w:gridCol w:w="1249"/>
+        <w:gridCol w:w="1280"/>
+        <w:gridCol w:w="1615"/>
+        <w:gridCol w:w="1538"/>
       </w:tblGrid>
       <w:tr>
         <w:trPr>
@@ -6936,7 +6936,7 @@
         </w:tc>
         <w:tc>
           <w:tcPr>
-            <w:tcW w:type="dxa" w:w="1251"/>
+            <w:tcW w:type="dxa" w:w="1249"/>
             <w:tcMar>
               <w:top w:type="dxa" w:w="40"/>
               <w:left w:type="dxa" w:w="80"/>
@@ -6961,7 +6961,7 @@
         </w:tc>
         <w:tc>
           <w:tcPr>
-            <w:tcW w:type="dxa" w:w="1283"/>
+            <w:tcW w:type="dxa" w:w="1280"/>
             <w:tcMar>
               <w:top w:type="dxa" w:w="40"/>
               <w:left w:type="dxa" w:w="80"/>
@@ -6986,7 +6986,7 @@
         </w:tc>
         <w:tc>
           <w:tcPr>
-            <w:tcW w:type="dxa" w:w="1609"/>
+            <w:tcW w:type="dxa" w:w="1615"/>
             <w:tcMar>
               <w:top w:type="dxa" w:w="40"/>
               <w:left w:type="dxa" w:w="80"/>
@@ -7011,7 +7011,7 @@
         </w:tc>
         <w:tc>
           <w:tcPr>
-            <w:tcW w:type="dxa" w:w="1539"/>
+            <w:tcW w:type="dxa" w:w="1538"/>
             <w:tcMar>
               <w:top w:type="dxa" w:w="40"/>
               <w:left w:type="dxa" w:w="80"/>
@@ -7084,7 +7084,7 @@
         </w:tc>
         <w:tc>
           <w:tcPr>
-            <w:tcW w:type="dxa" w:w="1251"/>
+            <w:tcW w:type="dxa" w:w="1249"/>
             <w:tcMar>
               <w:top w:type="dxa" w:w="40"/>
               <w:left w:type="dxa" w:w="80"/>
@@ -7105,7 +7105,7 @@
         </w:tc>
         <w:tc>
           <w:tcPr>
-            <w:tcW w:type="dxa" w:w="1283"/>
+            <w:tcW w:type="dxa" w:w="1280"/>
             <w:tcMar>
               <w:top w:type="dxa" w:w="40"/>
               <w:left w:type="dxa" w:w="80"/>
@@ -7126,7 +7126,7 @@
         </w:tc>
         <w:tc>
           <w:tcPr>
-            <w:tcW w:type="dxa" w:w="1609"/>
+            <w:tcW w:type="dxa" w:w="1615"/>
             <w:tcMar>
               <w:top w:type="dxa" w:w="40"/>
               <w:left w:type="dxa" w:w="80"/>
@@ -7147,7 +7147,7 @@
         </w:tc>
         <w:tc>
           <w:tcPr>
-            <w:tcW w:type="dxa" w:w="1539"/>
+            <w:tcW w:type="dxa" w:w="1538"/>
             <w:tcMar>
               <w:top w:type="dxa" w:w="40"/>
               <w:left w:type="dxa" w:w="80"/>
@@ -7216,7 +7216,7 @@
         </w:tc>
         <w:tc>
           <w:tcPr>
-            <w:tcW w:type="dxa" w:w="1251"/>
+            <w:tcW w:type="dxa" w:w="1249"/>
             <w:tcMar>
               <w:top w:type="dxa" w:w="40"/>
               <w:left w:type="dxa" w:w="80"/>
@@ -7237,7 +7237,7 @@
         </w:tc>
         <w:tc>
           <w:tcPr>
-            <w:tcW w:type="dxa" w:w="1283"/>
+            <w:tcW w:type="dxa" w:w="1280"/>
             <w:tcMar>
               <w:top w:type="dxa" w:w="40"/>
               <w:left w:type="dxa" w:w="80"/>
@@ -7258,7 +7258,7 @@
         </w:tc>
         <w:tc>
           <w:tcPr>
-            <w:tcW w:type="dxa" w:w="1609"/>
+            <w:tcW w:type="dxa" w:w="1615"/>
             <w:tcMar>
               <w:top w:type="dxa" w:w="40"/>
               <w:left w:type="dxa" w:w="80"/>
@@ -7279,7 +7279,7 @@
         </w:tc>
         <w:tc>
           <w:tcPr>
-            <w:tcW w:type="dxa" w:w="1539"/>
+            <w:tcW w:type="dxa" w:w="1538"/>
             <w:tcMar>
               <w:top w:type="dxa" w:w="40"/>
               <w:left w:type="dxa" w:w="80"/>
@@ -7348,7 +7348,7 @@
         </w:tc>
         <w:tc>
           <w:tcPr>
-            <w:tcW w:type="dxa" w:w="1251"/>
+            <w:tcW w:type="dxa" w:w="1249"/>
             <w:tcMar>
               <w:top w:type="dxa" w:w="40"/>
               <w:left w:type="dxa" w:w="80"/>
@@ -7369,7 +7369,7 @@
         </w:tc>
         <w:tc>
           <w:tcPr>
-            <w:tcW w:type="dxa" w:w="1283"/>
+            <w:tcW w:type="dxa" w:w="1280"/>
             <w:tcMar>
               <w:top w:type="dxa" w:w="40"/>
               <w:left w:type="dxa" w:w="80"/>
@@ -7390,7 +7390,7 @@
         </w:tc>
         <w:tc>
           <w:tcPr>
-            <w:tcW w:type="dxa" w:w="1609"/>
+            <w:tcW w:type="dxa" w:w="1615"/>
             <w:tcMar>
               <w:top w:type="dxa" w:w="40"/>
               <w:left w:type="dxa" w:w="80"/>
@@ -7411,7 +7411,7 @@
         </w:tc>
         <w:tc>
           <w:tcPr>
-            <w:tcW w:type="dxa" w:w="1539"/>
+            <w:tcW w:type="dxa" w:w="1538"/>
             <w:tcMar>
               <w:top w:type="dxa" w:w="40"/>
               <w:left w:type="dxa" w:w="80"/>
@@ -7480,7 +7480,7 @@
         </w:tc>
         <w:tc>
           <w:tcPr>
-            <w:tcW w:type="dxa" w:w="1251"/>
+            <w:tcW w:type="dxa" w:w="1249"/>
             <w:tcMar>
               <w:top w:type="dxa" w:w="40"/>
               <w:left w:type="dxa" w:w="80"/>
@@ -7501,7 +7501,7 @@
         </w:tc>
         <w:tc>
           <w:tcPr>
-            <w:tcW w:type="dxa" w:w="1283"/>
+            <w:tcW w:type="dxa" w:w="1280"/>
             <w:tcMar>
               <w:top w:type="dxa" w:w="40"/>
               <w:left w:type="dxa" w:w="80"/>
@@ -7522,7 +7522,7 @@
         </w:tc>
         <w:tc>
           <w:tcPr>
-            <w:tcW w:type="dxa" w:w="1609"/>
+            <w:tcW w:type="dxa" w:w="1615"/>
             <w:tcMar>
               <w:top w:type="dxa" w:w="40"/>
               <w:left w:type="dxa" w:w="80"/>
@@ -7543,7 +7543,7 @@
         </w:tc>
         <w:tc>
           <w:tcPr>
-            <w:tcW w:type="dxa" w:w="1539"/>
+            <w:tcW w:type="dxa" w:w="1538"/>
             <w:tcMar>
               <w:top w:type="dxa" w:w="40"/>
               <w:left w:type="dxa" w:w="80"/>
@@ -7612,7 +7612,7 @@
         </w:tc>
         <w:tc>
           <w:tcPr>
-            <w:tcW w:type="dxa" w:w="1251"/>
+            <w:tcW w:type="dxa" w:w="1249"/>
             <w:tcMar>
               <w:top w:type="dxa" w:w="40"/>
               <w:left w:type="dxa" w:w="80"/>
@@ -7633,7 +7633,7 @@
         </w:tc>
         <w:tc>
           <w:tcPr>
-            <w:tcW w:type="dxa" w:w="1283"/>
+            <w:tcW w:type="dxa" w:w="1280"/>
             <w:tcMar>
               <w:top w:type="dxa" w:w="40"/>
               <w:left w:type="dxa" w:w="80"/>
@@ -7654,7 +7654,7 @@
         </w:tc>
         <w:tc>
           <w:tcPr>
-            <w:tcW w:type="dxa" w:w="1609"/>
+            <w:tcW w:type="dxa" w:w="1615"/>
             <w:tcMar>
               <w:top w:type="dxa" w:w="40"/>
               <w:left w:type="dxa" w:w="80"/>
@@ -7675,7 +7675,7 @@
         </w:tc>
         <w:tc>
           <w:tcPr>
-            <w:tcW w:type="dxa" w:w="1539"/>
+            <w:tcW w:type="dxa" w:w="1538"/>
             <w:tcMar>
               <w:top w:type="dxa" w:w="40"/>
               <w:left w:type="dxa" w:w="80"/>
@@ -7744,7 +7744,7 @@
         </w:tc>
         <w:tc>
           <w:tcPr>
-            <w:tcW w:type="dxa" w:w="1251"/>
+            <w:tcW w:type="dxa" w:w="1249"/>
             <w:tcMar>
               <w:top w:type="dxa" w:w="40"/>
               <w:left w:type="dxa" w:w="80"/>
@@ -7765,7 +7765,7 @@
         </w:tc>
         <w:tc>
           <w:tcPr>
-            <w:tcW w:type="dxa" w:w="1283"/>
+            <w:tcW w:type="dxa" w:w="1280"/>
             <w:tcMar>
               <w:top w:type="dxa" w:w="40"/>
               <w:left w:type="dxa" w:w="80"/>
@@ -7786,7 +7786,7 @@
         </w:tc>
         <w:tc>
           <w:tcPr>
-            <w:tcW w:type="dxa" w:w="1609"/>
+            <w:tcW w:type="dxa" w:w="1615"/>
             <w:tcMar>
               <w:top w:type="dxa" w:w="40"/>
               <w:left w:type="dxa" w:w="80"/>
@@ -7807,7 +7807,7 @@
         </w:tc>
         <w:tc>
           <w:tcPr>
-            <w:tcW w:type="dxa" w:w="1539"/>
+            <w:tcW w:type="dxa" w:w="1538"/>
             <w:tcMar>
               <w:top w:type="dxa" w:w="40"/>
               <w:left w:type="dxa" w:w="80"/>
@@ -7876,7 +7876,7 @@
         </w:tc>
         <w:tc>
           <w:tcPr>
-            <w:tcW w:type="dxa" w:w="1251"/>
+            <w:tcW w:type="dxa" w:w="1249"/>
             <w:tcMar>
               <w:top w:type="dxa" w:w="40"/>
               <w:left w:type="dxa" w:w="80"/>
@@ -7897,7 +7897,7 @@
         </w:tc>
         <w:tc>
           <w:tcPr>
-            <w:tcW w:type="dxa" w:w="1283"/>
+            <w:tcW w:type="dxa" w:w="1280"/>
             <w:tcMar>
               <w:top w:type="dxa" w:w="40"/>
               <w:left w:type="dxa" w:w="80"/>
@@ -7918,7 +7918,7 @@
         </w:tc>
         <w:tc>
           <w:tcPr>
-            <w:tcW w:type="dxa" w:w="1609"/>
+            <w:tcW w:type="dxa" w:w="1615"/>
             <w:tcMar>
               <w:top w:type="dxa" w:w="40"/>
               <w:left w:type="dxa" w:w="80"/>
@@ -7939,7 +7939,7 @@
         </w:tc>
         <w:tc>
           <w:tcPr>
-            <w:tcW w:type="dxa" w:w="1539"/>
+            <w:tcW w:type="dxa" w:w="1538"/>
             <w:tcMar>
               <w:top w:type="dxa" w:w="40"/>
               <w:left w:type="dxa" w:w="80"/>
@@ -8008,7 +8008,7 @@
         </w:tc>
         <w:tc>
           <w:tcPr>
-            <w:tcW w:type="dxa" w:w="1251"/>
+            <w:tcW w:type="dxa" w:w="1249"/>
             <w:tcMar>
               <w:top w:type="dxa" w:w="40"/>
               <w:left w:type="dxa" w:w="80"/>
@@ -8029,7 +8029,7 @@
         </w:tc>
         <w:tc>
           <w:tcPr>
-            <w:tcW w:type="dxa" w:w="1283"/>
+            <w:tcW w:type="dxa" w:w="1280"/>
             <w:tcMar>
               <w:top w:type="dxa" w:w="40"/>
               <w:left w:type="dxa" w:w="80"/>
@@ -8050,7 +8050,7 @@
         </w:tc>
         <w:tc>
           <w:tcPr>
-            <w:tcW w:type="dxa" w:w="1609"/>
+            <w:tcW w:type="dxa" w:w="1615"/>
             <w:tcMar>
               <w:top w:type="dxa" w:w="40"/>
               <w:left w:type="dxa" w:w="80"/>
@@ -8071,7 +8071,7 @@
         </w:tc>
         <w:tc>
           <w:tcPr>
-            <w:tcW w:type="dxa" w:w="1539"/>
+            <w:tcW w:type="dxa" w:w="1538"/>
             <w:tcMar>
               <w:top w:type="dxa" w:w="40"/>
               <w:left w:type="dxa" w:w="80"/>
@@ -8140,7 +8140,7 @@
         </w:tc>
         <w:tc>
           <w:tcPr>
-            <w:tcW w:type="dxa" w:w="1251"/>
+            <w:tcW w:type="dxa" w:w="1249"/>
             <w:tcMar>
               <w:top w:type="dxa" w:w="40"/>
               <w:left w:type="dxa" w:w="80"/>
@@ -8161,7 +8161,7 @@
         </w:tc>
         <w:tc>
           <w:tcPr>
-            <w:tcW w:type="dxa" w:w="1283"/>
+            <w:tcW w:type="dxa" w:w="1280"/>
             <w:tcMar>
               <w:top w:type="dxa" w:w="40"/>
               <w:left w:type="dxa" w:w="80"/>
@@ -8182,7 +8182,7 @@
         </w:tc>
         <w:tc>
           <w:tcPr>
-            <w:tcW w:type="dxa" w:w="1609"/>
+            <w:tcW w:type="dxa" w:w="1615"/>
             <w:tcMar>
               <w:top w:type="dxa" w:w="40"/>
               <w:left w:type="dxa" w:w="80"/>
@@ -8203,7 +8203,7 @@
         </w:tc>
         <w:tc>
           <w:tcPr>
-            <w:tcW w:type="dxa" w:w="1539"/>
+            <w:tcW w:type="dxa" w:w="1538"/>
             <w:tcMar>
               <w:top w:type="dxa" w:w="40"/>
               <w:left w:type="dxa" w:w="80"/>
@@ -8272,7 +8272,7 @@
         </w:tc>
         <w:tc>
           <w:tcPr>
-            <w:tcW w:type="dxa" w:w="1251"/>
+            <w:tcW w:type="dxa" w:w="1249"/>
             <w:tcMar>
               <w:top w:type="dxa" w:w="40"/>
               <w:left w:type="dxa" w:w="80"/>
@@ -8293,7 +8293,7 @@
         </w:tc>
         <w:tc>
           <w:tcPr>
-            <w:tcW w:type="dxa" w:w="1283"/>
+            <w:tcW w:type="dxa" w:w="1280"/>
             <w:tcMar>
               <w:top w:type="dxa" w:w="40"/>
               <w:left w:type="dxa" w:w="80"/>
@@ -8314,28 +8314,28 @@
         </w:tc>
         <w:tc>
           <w:tcPr>
-            <w:tcW w:type="dxa" w:w="1609"/>
-            <w:tcMar>
-              <w:top w:type="dxa" w:w="40"/>
-              <w:left w:type="dxa" w:w="80"/>
-              <w:bottom w:type="dxa" w:w="40"/>
-              <w:right w:type="dxa" w:w="80"/>
-            </w:tcMar>
-            <w:vAlign w:val="center"/>
-          </w:tcPr>
-          <w:p>
-            <w:pPr>
-              <w:pStyle w:val="TexteTableau"/>
-              <w:jc w:val="center"/>
-            </w:pPr>
-            <w:r>
-              <w:t xml:space="preserve">réseau appris sur quatre enregistrements en boucle ouverte (15 s) ; ensemble de gains admissibles (181 s)</w:t>
-            </w:r>
-          </w:p>
-        </w:tc>
-        <w:tc>
-          <w:tcPr>
-            <w:tcW w:type="dxa" w:w="1539"/>
+            <w:tcW w:type="dxa" w:w="1615"/>
+            <w:tcMar>
+              <w:top w:type="dxa" w:w="40"/>
+              <w:left w:type="dxa" w:w="80"/>
+              <w:bottom w:type="dxa" w:w="40"/>
+              <w:right w:type="dxa" w:w="80"/>
+            </w:tcMar>
+            <w:vAlign w:val="center"/>
+          </w:tcPr>
+          <w:p>
+            <w:pPr>
+              <w:pStyle w:val="TexteTableau"/>
+              <w:jc w:val="center"/>
+            </w:pPr>
+            <w:r>
+              <w:t xml:space="preserve">réseau appris sur quatre enregistrements en boucle ouverte (14,8 s) ; ensemble de gains admissibles (181 s)</w:t>
+            </w:r>
+          </w:p>
+        </w:tc>
+        <w:tc>
+          <w:tcPr>
+            <w:tcW w:type="dxa" w:w="1538"/>
             <w:tcMar>
               <w:top w:type="dxa" w:w="40"/>
               <w:left w:type="dxa" w:w="80"/>
@@ -8793,67 +8793,17 @@
     </w:p>
     <w:p>
       <w:r>
-        <w:t xml:space="preserve">Dans l'ELM-PID, le réseau sert au gradient de la boucle d'adaptation : il fournit la sensibilité de la tension de sortie au rapport cyclique, ∂</w:t>
+        <w:t xml:space="preserve">Dans l'ELM-PID, le réseau sert au gradient de la boucle d'adaptation : il fournit le jacobien </w:t>
       </w:r>
       <w:r>
         <w:rPr>
           <w:i/>
           <w:iCs/>
         </w:rPr>
-        <w:t xml:space="preserve">v</w:t>
-      </w:r>
-      <w:r>
-        <w:t xml:space="preserve">o/∂</w:t>
-      </w:r>
-      <w:r>
-        <w:rPr>
-          <w:i/>
-          <w:iCs/>
-        </w:rPr>
-        <w:t xml:space="preserve">d</w:t>
-      </w:r>
-      <w:r>
-        <w:t xml:space="preserve">. Il est en outre mis à jour en ligne par l'algorithme OS-ELM [Liang et al., 2006]. Pour mesurer ce que ces deux éléments apportent, nous avons comparé l'ELM-PID à deux variantes déjà définies lors de sa mise au point : l'une remplace le jacobien du réseau par une constante, l'autre supprime la mise à jour en ligne. Les critères et les prévisions ont été écrits avant le calcul, et le verdict suit la règle de séparation de la section 5.2.3.</w:t>
-      </w:r>
-    </w:p>
-    <w:p>
-      <w:r>
-        <w:t xml:space="preserve">Le jacobien constant augmente l'IAE de 1,09 % sur S2, de 1,82 % sur S3 et de 2,64 % sur S8a, et ces écarts sont séparés dans les trois cas. Sur S10, il fait au contraire mieux que le réseau au nominal (−9,76 %), mais l'écart n'est pas séparé : il va de −9,76 à +4,01 % selon la version du circuit. Pour comparaison, l'IAE de l'ELM-PID lui-même varie de 7,88 à 8,63 mV·s sur S10 avec ces variations de 0,1 % du circuit. Sans mise à jour en ligne, l'IAE est inchangée sur S2 et S3. Sur S8a, elle baisse de 0,04 % au nominal, écart séparé : sans OS-ELM, la méthode fait très légèrement mieux. Sur S10, l'écart nominal est de −0,90 %, non séparé.</w:t>
-      </w:r>
-    </w:p>
-    <w:p>
-      <w:r>
-        <w:t xml:space="preserve">Les prévisions sont justes pour la mise à jour en ligne : écart nul sur S2 et S3, inférieur à 0,1 % sur S8a, inférieur à 2 % sur S10. Sur S8a, cette borne de 0,1 % ne tient qu'au nominal : l'écart atteint −0,38 % dans une des versions du circuit. Elles sont justes aussi pour le jacobien constant sur S2, S3 et S8a (+1 à +3 %), dont la séparation avait été annoncée incertaine et s'est vérifiée dans les trois cas. Une prévision est fausse : sur S10, le jacobien constant fait mieux que le réseau au nominal, cas que les critères écrits avant le calcul classaient comme une prévision fausse.</w:t>
-      </w:r>
-    </w:p>
-    <w:p>
-      <w:r>
-        <w:t xml:space="preserve">Ces résultats s'accordent avec ce que l'on sait du réseau. Sur 4 615 fenêtres de contrôle, la sensibilité vraie du convertisseur varie avec la charge, de 11,2 V par unité de rapport cyclique (médiane, 4 à 6 Ω) à 15,8 V (50 à 99 Ω). Celle du réseau reste autour de 11 V (médianes de 11,06 à 11,44 V selon la classe de charge), et la corrélation entre les logarithmes du jacobien du réseau et du jacobien vrai est de −0,04. Le réseau ne reçoit que des moyennes par fenêtre : celles de la tension de sortie sur les deux fenêtres précédentes, celles du rapport cyclique sur la fenêtre courante et les deux précédentes. Avec ces seules entrées, la charge n'est pas observable à l'échelle d'une fenêtre de 0,5 ms. Le réseau agit donc comme un identificateur qui donne à la boucle le signe et l'ordre de grandeur de ∂</w:t>
-      </w:r>
-      <w:r>
-        <w:rPr>
-          <w:i/>
-          <w:iCs/>
-        </w:rPr>
-        <w:t xml:space="preserve">v</w:t>
-      </w:r>
-      <w:r>
-        <w:t xml:space="preserve">o/∂</w:t>
-      </w:r>
-      <w:r>
-        <w:rPr>
-          <w:i/>
-          <w:iCs/>
-        </w:rPr>
-        <w:t xml:space="preserve">d</w:t>
-      </w:r>
-      <w:r>
-        <w:t xml:space="preserve"> ; ce n'est pas un estimateur de l'état du convertisseur.</w:t>
-      </w:r>
-    </w:p>
-    <w:p>
-      <w:r>
-        <w:t xml:space="preserve">La forme de la loi d'adaptation explique pourquoi un jacobien aussi peu précis suffit. À la fin de chaque fenêtre </w:t>
+        <w:t xml:space="preserve">J</w:t>
+      </w:r>
+      <w:r>
+        <w:t xml:space="preserve">(</w:t>
       </w:r>
       <w:r>
         <w:rPr>
@@ -8863,122 +8813,37 @@
         <w:t xml:space="preserve">n</w:t>
       </w:r>
       <w:r>
-        <w:t xml:space="preserve">, le pas des gains suit un gradient normalisé, repris de [Lu et al., 2021] :</w:t>
-      </w:r>
-    </w:p>
-    <w:p>
-      <w:pPr>
-        <w:pStyle w:val="Equation"/>
-      </w:pPr>
-      <w:r>
-        <w:tab/>
-      </w:r>
-      <m:oMath>
-        <m:r>
-          <m:rPr>
-            <m:sty m:val="p"/>
-          </m:rPr>
-          <w:rPr>
-            <w:rFonts w:ascii="Cambria Math" w:hAnsi="Cambria Math"/>
-          </w:rPr>
-          <m:t xml:space="preserve">Δ</m:t>
-        </m:r>
-        <m:r>
-          <w:rPr>
-            <w:rFonts w:ascii="Cambria Math" w:hAnsi="Cambria Math"/>
-          </w:rPr>
-          <m:t xml:space="preserve">x(n)=</m:t>
-        </m:r>
-        <m:f>
-          <m:num>
-            <m:r>
-              <w:rPr>
-                <w:rFonts w:ascii="Cambria Math" w:hAnsi="Cambria Math"/>
-              </w:rPr>
-              <m:t xml:space="preserve">η</m:t>
-            </m:r>
-            <m:acc>
-              <m:accPr>
-                <m:chr m:val="̄"/>
-              </m:accPr>
-              <m:e>
-                <m:r>
-                  <w:rPr>
-                    <w:rFonts w:ascii="Cambria Math" w:hAnsi="Cambria Math"/>
-                  </w:rPr>
-                  <m:t xml:space="preserve">e</m:t>
-                </m:r>
-              </m:e>
-            </m:acc>
-            <m:r>
-              <w:rPr>
-                <w:rFonts w:ascii="Cambria Math" w:hAnsi="Cambria Math"/>
-              </w:rPr>
-              <m:t xml:space="preserve">(n)φ(n)</m:t>
-            </m:r>
-          </m:num>
-          <m:den>
-            <m:r>
-              <w:rPr>
-                <w:rFonts w:ascii="Cambria Math" w:hAnsi="Cambria Math"/>
-              </w:rPr>
-              <m:t xml:space="preserve">ε+φ(n)·φ(n)</m:t>
-            </m:r>
-          </m:den>
-        </m:f>
-        <m:r>
-          <m:rPr>
-            <m:nor/>
-          </m:rPr>
-          <w:rPr>
-            <w:rFonts w:ascii="Times New Roman" w:hAnsi="Times New Roman"/>
-          </w:rPr>
-          <m:t xml:space="preserve">, avec </m:t>
-        </m:r>
-        <m:r>
-          <w:rPr>
-            <w:rFonts w:ascii="Cambria Math" w:hAnsi="Cambria Math"/>
-          </w:rPr>
-          <m:t xml:space="preserve">φ(n)=J(n)s(n)</m:t>
-        </m:r>
-        <m:r>
-          <m:rPr>
-            <m:nor/>
-          </m:rPr>
-          <w:rPr>
-            <w:rFonts w:ascii="Times New Roman" w:hAnsi="Times New Roman"/>
-          </w:rPr>
-          <m:t xml:space="preserve">,</m:t>
-        </m:r>
-      </m:oMath>
-      <w:r>
-        <w:tab/>
-        <w:t xml:space="preserve">(5.4)</w:t>
-      </w:r>
-    </w:p>
-    <w:p>
-      <w:r>
-        <w:t xml:space="preserve">où </w:t>
+        <w:t xml:space="preserve">) = ∂ŷ/∂d̄, sensibilité de la moyenne de la tension mesurée sur une fenêtre de 0,5 ms à la moyenne du rapport cyclique (équation (4.5)). Il est en outre mis à jour en ligne par l'algorithme OS-ELM [Liang et al., 2006]. Pour mesurer ce que ces deux éléments apportent, nous avons comparé l'ELM-PID à deux variantes déjà définies lors de sa mise au point (section 4.4.4) : l'une remplace le jacobien du réseau par une constante, l'autre supprime la mise à jour en ligne. Les critères et les prévisions ont été écrits avant le calcul, et le verdict suit la règle de séparation de la section 5.2.3.</w:t>
+      </w:r>
+    </w:p>
+    <w:p>
+      <w:r>
+        <w:t xml:space="preserve">Le jacobien constant augmente l'IAE de 1,09 % sur S2, de 1,82 % sur S3 et de 2,64 % sur S8a, et ces écarts sont séparés dans les trois cas. Sur S10, il fait au contraire mieux que le réseau au nominal (−9,76 %), mais l'écart n'est pas séparé : il va de −9,76 à +4,01 % selon la version du circuit. Pour comparaison, l'IAE de l'ELM-PID lui-même varie de 7,88 à 8,63 mV·s sur S10 avec ces variations de 0,1 % du circuit. Sans mise à jour en ligne, l'IAE est inchangée sur S2 et S3. Sur S8a, elle baisse de 0,04 % au nominal, écart séparé : sans OS-ELM, la méthode fait très légèrement mieux. Sur S10, l'écart nominal est de −0,90 %, non séparé.</w:t>
+      </w:r>
+    </w:p>
+    <w:p>
+      <w:r>
+        <w:t xml:space="preserve">Les prévisions sont justes pour la mise à jour en ligne : écart nul sur S2 et S3, inférieur à 0,1 % sur S8a, inférieur à 2 % sur S10. Sur S8a, cette borne de 0,1 % ne tient qu'au nominal : l'écart atteint −0,38 % dans une des versions du circuit. Elles sont justes aussi pour le jacobien constant sur S2, S3 et S8a (+1 à +3 %), dont la séparation avait été annoncée incertaine et s'est vérifiée dans les trois cas. Une prévision est fausse : sur S10, le jacobien constant fait mieux que le réseau au nominal, cas que les critères écrits avant le calcul classaient comme une prévision fausse.</w:t>
+      </w:r>
+    </w:p>
+    <w:p>
+      <w:r>
+        <w:t xml:space="preserve">Ces résultats s'accordent avec ce que l'on sait du réseau. Sur 4 615 fenêtres de contrôle, le jacobien vrai du convertisseur, calculé sur le banc (section 4.3.2), varie avec la charge, de 11,2 V par unité de rapport cyclique (médiane, 4 à 6 Ω) à 15,8 V (50 à 99 Ω). Celui du réseau reste autour de 11 V (médianes de 11,06 à 11,44 V selon la classe de charge), et la corrélation entre les logarithmes du jacobien du réseau et du jacobien vrai est de −0,04. Le réseau ne reçoit que des moyennes par fenêtre : celles de la tension mesurée sur les deux fenêtres précédentes, celles du rapport cyclique sur la fenêtre courante et les deux précédentes. Avec ces seules entrées, la charge n'est pas observable à l'échelle d'une fenêtre de 0,5 ms. Le réseau agit donc comme un identificateur qui donne à la boucle le signe et l'ordre de grandeur de ∂ŷ/∂d̄ ; ce n'est pas un estimateur de l'état du convertisseur.</w:t>
+      </w:r>
+    </w:p>
+    <w:p>
+      <w:r>
+        <w:t xml:space="preserve">La forme de la loi d'adaptation explique pourquoi un jacobien aussi peu précis suffit. À la fin de chaque fenêtre, les multiplicateurs des gains suivent le gradient normalisé de la loi (4.7), repris de [Lu et al., 2021]. Dans cette loi, la sensibilité </w:t>
       </w:r>
       <w:r>
         <w:rPr>
           <w:i/>
           <w:iCs/>
         </w:rPr>
-        <w:t xml:space="preserve">x</w:t>
-      </w:r>
-      <w:r>
-        <w:t xml:space="preserve"> est le vecteur des gains rapportés à ceux de Ziegler-Nichols, </w:t>
-      </w:r>
-      <w:r>
-        <w:rPr>
-          <w:i/>
-          <w:iCs/>
-        </w:rPr>
-        <w:t xml:space="preserve">ē</w:t>
-      </w:r>
-      <w:r>
-        <w:t xml:space="preserve"> l'erreur moyenne de la fenêtre, </w:t>
+        <w:t xml:space="preserve">φ</w:t>
+      </w:r>
+      <w:r>
+        <w:t xml:space="preserve"> de la tension moyenne aux multiplicateurs est le produit du jacobien </w:t>
       </w:r>
       <w:r>
         <w:rPr>
@@ -8988,27 +8853,7 @@
         <w:t xml:space="preserve">J</w:t>
       </w:r>
       <w:r>
-        <w:t xml:space="preserve"> la sensibilité ∂</w:t>
-      </w:r>
-      <w:r>
-        <w:rPr>
-          <w:i/>
-          <w:iCs/>
-        </w:rPr>
-        <w:t xml:space="preserve">v</w:t>
-      </w:r>
-      <w:r>
-        <w:t xml:space="preserve">o/∂</w:t>
-      </w:r>
-      <w:r>
-        <w:rPr>
-          <w:i/>
-          <w:iCs/>
-        </w:rPr>
-        <w:t xml:space="preserve">d</w:t>
-      </w:r>
-      <w:r>
-        <w:t xml:space="preserve"> donnée par le réseau, </w:t>
+        <w:t xml:space="preserve"> par le vecteur </w:t>
       </w:r>
       <w:r>
         <w:rPr>
@@ -9018,7 +8863,57 @@
         <w:t xml:space="preserve">s</w:t>
       </w:r>
       <w:r>
-        <w:t xml:space="preserve"> la sensibilité de la commande aux gains sur la fenêtre, </w:t>
+        <w:t xml:space="preserve"> ⊙ </w:t>
+      </w:r>
+      <w:r>
+        <w:rPr>
+          <w:i/>
+          <w:iCs/>
+        </w:rPr>
+        <w:t xml:space="preserve">K</w:t>
+      </w:r>
+      <w:r>
+        <w:t xml:space="preserve">ZN, qui ne dépend que de l'erreur, et le pas est divisé par </w:t>
+      </w:r>
+      <w:r>
+        <w:rPr>
+          <w:i/>
+          <w:iCs/>
+        </w:rPr>
+        <w:t xml:space="preserve">ε</w:t>
+      </w:r>
+      <w:r>
+        <w:t xml:space="preserve"> + |</w:t>
+      </w:r>
+      <w:r>
+        <w:rPr>
+          <w:i/>
+          <w:iCs/>
+        </w:rPr>
+        <w:t xml:space="preserve">φ</w:t>
+      </w:r>
+      <w:r>
+        <w:t xml:space="preserve">|², avec </w:t>
+      </w:r>
+      <w:r>
+        <w:rPr>
+          <w:i/>
+          <w:iCs/>
+        </w:rPr>
+        <w:t xml:space="preserve">ε</w:t>
+      </w:r>
+      <w:r>
+        <w:t xml:space="preserve"> = 10⁻³. Quand </w:t>
+      </w:r>
+      <w:r>
+        <w:rPr>
+          <w:i/>
+          <w:iCs/>
+        </w:rPr>
+        <w:t xml:space="preserve">ε</w:t>
+      </w:r>
+      <w:r>
+        <w:t xml:space="preserve"> est négligeable, le terme de gradient vaut à peu près </w:t>
       </w:r>
       <w:r>
         <w:rPr>
@@ -9028,47 +8923,7 @@
         <w:t xml:space="preserve">η</w:t>
       </w:r>
       <w:r>
-        <w:t xml:space="preserve"> = 0,5 le pas et </w:t>
-      </w:r>
-      <w:r>
-        <w:rPr>
-          <w:i/>
-          <w:iCs/>
-        </w:rPr>
-        <w:t xml:space="preserve">ε</w:t>
-      </w:r>
-      <w:r>
-        <w:t xml:space="preserve"> = 10⁻³ une petite constante de régularisation. Quand </w:t>
-      </w:r>
-      <w:r>
-        <w:rPr>
-          <w:i/>
-          <w:iCs/>
-        </w:rPr>
-        <w:t xml:space="preserve">ε</w:t>
-      </w:r>
-      <w:r>
-        <w:t xml:space="preserve"> est négligeable, le pas vaut à peu près </w:t>
-      </w:r>
-      <w:r>
-        <w:rPr>
-          <w:i/>
-          <w:iCs/>
-        </w:rPr>
-        <w:t xml:space="preserve">η</w:t>
-      </w:r>
-      <w:r>
-        <w:t xml:space="preserve"> </w:t>
-      </w:r>
-      <w:r>
-        <w:rPr>
-          <w:i/>
-          <w:iCs/>
-        </w:rPr>
-        <w:t xml:space="preserve">ē</w:t>
-      </w:r>
-      <w:r>
-        <w:t xml:space="preserve"> </w:t>
+        <w:t xml:space="preserve"> ē (</w:t>
       </w:r>
       <w:r>
         <w:rPr>
@@ -9078,7 +8933,17 @@
         <w:t xml:space="preserve">s</w:t>
       </w:r>
       <w:r>
-        <w:t xml:space="preserve"> / (</w:t>
+        <w:t xml:space="preserve"> ⊙ </w:t>
+      </w:r>
+      <w:r>
+        <w:rPr>
+          <w:i/>
+          <w:iCs/>
+        </w:rPr>
+        <w:t xml:space="preserve">K</w:t>
+      </w:r>
+      <w:r>
+        <w:t xml:space="preserve">ZN) / (</w:t>
       </w:r>
       <w:r>
         <w:rPr>
@@ -9098,7 +8963,17 @@
         <w:t xml:space="preserve">s</w:t>
       </w:r>
       <w:r>
-        <w:t xml:space="preserve">|²) : le jacobien n'en fixe que le signe et la longueur. Une erreur de 30 % sur </w:t>
+        <w:t xml:space="preserve"> ⊙ </w:t>
+      </w:r>
+      <w:r>
+        <w:rPr>
+          <w:i/>
+          <w:iCs/>
+        </w:rPr>
+        <w:t xml:space="preserve">K</w:t>
+      </w:r>
+      <w:r>
+        <w:t xml:space="preserve">ZN|²) : le jacobien n'en fixe que le signe et la longueur. Une erreur de 30 % sur </w:t>
       </w:r>
       <w:r>
         <w:rPr>
@@ -9108,7 +8983,17 @@
         <w:t xml:space="preserve">J</w:t>
       </w:r>
       <w:r>
-        <w:t xml:space="preserve"> change la longueur du pas de 30 %, pas sa direction.</w:t>
+        <w:t xml:space="preserve"> change la longueur du pas, pas sa direction. Le terme d'inertie de (4.7), de coefficient </w:t>
+      </w:r>
+      <w:r>
+        <w:rPr>
+          <w:i/>
+          <w:iCs/>
+        </w:rPr>
+        <w:t xml:space="preserve">α</w:t>
+      </w:r>
+      <w:r>
+        <w:t xml:space="preserve"> = 0,001, ne fait que prolonger le pas précédent.</w:t>
       </w:r>
     </w:p>
     <w:p>
@@ -9118,7 +9003,7 @@
     </w:p>
     <w:p>
       <w:r>
-        <w:t xml:space="preserve">Plusieurs limites encadrent ces conclusions. L'adaptation est bloquée tant que la commande est saturée, donc pendant toute la montée en tension. Sa boucle, par fenêtres de 0,5 ms, est trop lente pour agir pendant une perturbation brève, que le PID rattrape en environ 1,5 ms. Tout repose sur la simulation d'un seul convertisseur, sans essai sur montage réel. La règle de séparation dit si un ordre est reproductible sous des variations de 0,1 % de </w:t>
+        <w:t xml:space="preserve">Plusieurs limites encadrent ces conclusions. L'adaptation est bloquée tant que la commande est saturée, donc pendant toute la montée en tension. Sa boucle, par fenêtres de 0,5 ms, est trop lente pour agir pendant une perturbation brève : la porte se rouvre 1,5 à 2 ms après l'événement, quand le PID a déjà ramené l'erreur moyenne sous la zone morte. Tout repose sur la simulation d'un seul convertisseur, sans essai sur montage réel. La règle de séparation dit si un ordre est reproductible sous des variations de 0,1 % de </w:t>
       </w:r>
       <w:r>
         <w:rPr>

</xml_diff>